<commit_message>
feat: implement AJAX comment board and resolve script caching issues (v0.4.1)
</commit_message>
<xml_diff>
--- a/To do.docx
+++ b/To do.docx
@@ -131,21 +131,7 @@
                 <w:rStyle w:val="af3"/>
                 <w:noProof/>
               </w:rPr>
-              <w:t>實作</w:t>
-            </w:r>
-            <w:r>
-              <w:rPr>
-                <w:rStyle w:val="af3"/>
-                <w:noProof/>
-              </w:rPr>
-              <w:t>過</w:t>
-            </w:r>
-            <w:r>
-              <w:rPr>
-                <w:rStyle w:val="af3"/>
-                <w:noProof/>
-              </w:rPr>
-              <w:t>程</w:t>
+              <w:t>實作過程</w:t>
             </w:r>
             <w:r>
               <w:rPr>
@@ -485,14 +471,7 @@
                 <w:rStyle w:val="af3"/>
                 <w:noProof/>
               </w:rPr>
-              <w:t>頁面原</w:t>
-            </w:r>
-            <w:r>
-              <w:rPr>
-                <w:rStyle w:val="af3"/>
-                <w:noProof/>
-              </w:rPr>
-              <w:t>型</w:t>
+              <w:t>頁面原型</w:t>
             </w:r>
             <w:r>
               <w:rPr>
@@ -636,23 +615,7 @@
                 <w:noProof/>
                 <w:lang w:eastAsia="zh-CN"/>
               </w:rPr>
-              <w:t>問題與解</w:t>
-            </w:r>
-            <w:r>
-              <w:rPr>
-                <w:rStyle w:val="af3"/>
-                <w:noProof/>
-                <w:lang w:eastAsia="zh-CN"/>
-              </w:rPr>
-              <w:t>決</w:t>
-            </w:r>
-            <w:r>
-              <w:rPr>
-                <w:rStyle w:val="af3"/>
-                <w:noProof/>
-                <w:lang w:eastAsia="zh-CN"/>
-              </w:rPr>
-              <w:t>方式</w:t>
+              <w:t>問題與解決方式</w:t>
             </w:r>
             <w:r>
               <w:rPr>
@@ -6401,9 +6364,6 @@
     <w:p>
       <w:pPr>
         <w:pStyle w:val="1"/>
-        <w:rPr>
-          <w:rFonts w:hint="eastAsia"/>
-        </w:rPr>
       </w:pPr>
       <w:bookmarkStart w:id="8" w:name="_Toc231170777"/>
       <w:r>
@@ -6435,8 +6395,7 @@
       <w:pPr>
         <w:spacing w:before="120" w:after="120" w:line="336" w:lineRule="auto"/>
         <w:rPr>
-          <w:rFonts w:ascii="標楷體" w:eastAsia="DengXian" w:hAnsi="標楷體" w:hint="eastAsia"/>
-          <w:lang w:eastAsia="zh-CN"/>
+          <w:rFonts w:ascii="標楷體" w:eastAsia="DengXian" w:hAnsi="標楷體"/>
         </w:rPr>
       </w:pPr>
       <w:r>
@@ -6512,14 +6471,148 @@
       <w:pPr>
         <w:spacing w:before="120" w:after="120" w:line="336" w:lineRule="auto"/>
         <w:rPr>
+          <w:rFonts w:ascii="標楷體" w:eastAsia="DengXian" w:hAnsi="標楷體"/>
+        </w:rPr>
+      </w:pPr>
+      <w:r>
+        <w:rPr>
+          <w:rFonts w:ascii="Segoe UI Emoji" w:eastAsia="標楷體" w:hAnsi="Segoe UI Emoji" w:cs="Segoe UI Emoji"/>
+        </w:rPr>
+        <w:t>📌</w:t>
+      </w:r>
+      <w:r>
+        <w:rPr>
+          <w:rFonts w:ascii="標楷體" w:eastAsia="標楷體" w:hAnsi="標楷體"/>
+        </w:rPr>
+        <w:t xml:space="preserve"> 對應版本：v0.</w:t>
+      </w:r>
+      <w:r>
+        <w:rPr>
           <w:rFonts w:ascii="標楷體" w:eastAsia="DengXian" w:hAnsi="標楷體" w:hint="eastAsia"/>
-          <w:lang w:eastAsia="zh-CN"/>
-        </w:rPr>
-      </w:pPr>
-      <w:r>
-        <w:rPr>
-          <w:rFonts w:ascii="Segoe UI Emoji" w:eastAsia="標楷體" w:hAnsi="Segoe UI Emoji" w:cs="Segoe UI Emoji"/>
-        </w:rPr>
+        </w:rPr>
+        <w:t>3.0</w:t>
+      </w:r>
+    </w:p>
+    <w:p>
+      <w:pPr>
+        <w:spacing w:before="120" w:after="120" w:line="336" w:lineRule="auto"/>
+        <w:rPr>
+          <w:rFonts w:ascii="標楷體" w:eastAsia="DengXian" w:hAnsi="標楷體"/>
+        </w:rPr>
+      </w:pPr>
+    </w:p>
+    <w:p>
+      <w:pPr>
+        <w:spacing w:before="120" w:after="120" w:line="336" w:lineRule="auto"/>
+        <w:rPr>
+          <w:rFonts w:ascii="標楷體" w:eastAsia="標楷體" w:hAnsi="標楷體"/>
+        </w:rPr>
+      </w:pPr>
+      <w:r>
+        <w:rPr>
+          <w:rFonts w:ascii="Segoe UI Emoji" w:eastAsia="標楷體" w:hAnsi="Segoe UI Emoji" w:cs="Segoe UI Emoji"/>
+        </w:rPr>
+        <w:t>🚨</w:t>
+      </w:r>
+      <w:r>
+        <w:rPr>
+          <w:rFonts w:ascii="標楷體" w:eastAsia="標楷體" w:hAnsi="標楷體"/>
+        </w:rPr>
+        <w:t xml:space="preserve"> </w:t>
+      </w:r>
+      <w:r>
+        <w:rPr>
+          <w:rFonts w:ascii="標楷體" w:eastAsia="DengXian" w:hAnsi="標楷體" w:hint="eastAsia"/>
+        </w:rPr>
+        <w:t>2</w:t>
+      </w:r>
+      <w:r>
+        <w:rPr>
+          <w:rFonts w:ascii="標楷體" w:eastAsia="標楷體" w:hAnsi="標楷體"/>
+        </w:rPr>
+        <w:t>. SQL 關聯欄位名稱不匹配</w:t>
+      </w:r>
+    </w:p>
+    <w:p>
+      <w:pPr>
+        <w:spacing w:before="120" w:after="120" w:line="336" w:lineRule="auto"/>
+        <w:rPr>
+          <w:rFonts w:ascii="標楷體" w:eastAsia="DengXian" w:hAnsi="標楷體"/>
+        </w:rPr>
+      </w:pPr>
+      <w:r>
+        <w:rPr>
+          <w:rFonts w:ascii="Segoe UI Emoji" w:eastAsia="標楷體" w:hAnsi="Segoe UI Emoji" w:cs="Segoe UI Emoji"/>
+        </w:rPr>
+        <w:t>🔍</w:t>
+      </w:r>
+      <w:r>
+        <w:rPr>
+          <w:rFonts w:ascii="標楷體" w:eastAsia="標楷體" w:hAnsi="標楷體"/>
+        </w:rPr>
+        <w:t xml:space="preserve"> 當時狀況：在撈取書籍資料時，PHP 報錯找不到欄位。</w:t>
+      </w:r>
+    </w:p>
+    <w:p>
+      <w:pPr>
+        <w:spacing w:before="120" w:after="120" w:line="336" w:lineRule="auto"/>
+        <w:rPr>
+          <w:rFonts w:ascii="標楷體" w:eastAsia="標楷體" w:hAnsi="標楷體"/>
+        </w:rPr>
+      </w:pPr>
+      <w:r>
+        <w:rPr>
+          <w:rFonts w:ascii="Segoe UI Emoji" w:eastAsia="標楷體" w:hAnsi="Segoe UI Emoji" w:cs="Segoe UI Emoji"/>
+        </w:rPr>
+        <w:t>💡</w:t>
+      </w:r>
+      <w:r>
+        <w:rPr>
+          <w:rFonts w:ascii="標楷體" w:eastAsia="標楷體" w:hAnsi="標楷體"/>
+        </w:rPr>
+        <w:t xml:space="preserve"> 解決方式：經核對 ER 圖與真實資料庫，發現 Book 表記錄捐贈者的欄位為 </w:t>
+      </w:r>
+      <w:proofErr w:type="spellStart"/>
+      <w:r>
+        <w:rPr>
+          <w:rFonts w:ascii="標楷體" w:eastAsia="標楷體" w:hAnsi="標楷體"/>
+        </w:rPr>
+        <w:t>bdonor_id</w:t>
+      </w:r>
+      <w:proofErr w:type="spellEnd"/>
+      <w:r>
+        <w:rPr>
+          <w:rFonts w:ascii="標楷體" w:eastAsia="標楷體" w:hAnsi="標楷體"/>
+        </w:rPr>
+        <w:t xml:space="preserve">，而非原先預期的 </w:t>
+      </w:r>
+      <w:proofErr w:type="spellStart"/>
+      <w:r>
+        <w:rPr>
+          <w:rFonts w:ascii="標楷體" w:eastAsia="標楷體" w:hAnsi="標楷體"/>
+        </w:rPr>
+        <w:t>buser_id</w:t>
+      </w:r>
+      <w:proofErr w:type="spellEnd"/>
+      <w:r>
+        <w:rPr>
+          <w:rFonts w:ascii="標楷體" w:eastAsia="標楷體" w:hAnsi="標楷體"/>
+        </w:rPr>
+        <w:t>。修正 LEFT JOIN 語法後成功串接三張資料表。</w:t>
+      </w:r>
+    </w:p>
+    <w:p>
+      <w:pPr>
+        <w:spacing w:before="120" w:after="120" w:line="336" w:lineRule="auto"/>
+        <w:rPr>
+          <w:rFonts w:ascii="標楷體" w:eastAsia="DengXian" w:hAnsi="標楷體"/>
+        </w:rPr>
+      </w:pPr>
+      <w:r>
+        <w:rPr>
+          <w:rFonts w:ascii="Segoe UI Emoji" w:eastAsia="標楷體" w:hAnsi="Segoe UI Emoji" w:cs="Segoe UI Emoji"/>
+        </w:rPr>
+        <w:lastRenderedPageBreak/>
         <w:t>📌</w:t>
       </w:r>
       <w:r>
@@ -6531,119 +6624,62 @@
       <w:r>
         <w:rPr>
           <w:rFonts w:ascii="標楷體" w:eastAsia="DengXian" w:hAnsi="標楷體" w:hint="eastAsia"/>
-          <w:lang w:eastAsia="zh-CN"/>
-        </w:rPr>
-        <w:t>3.0</w:t>
-      </w:r>
-    </w:p>
-    <w:p>
-      <w:pPr>
-        <w:spacing w:before="120" w:after="120" w:line="336" w:lineRule="auto"/>
+        </w:rPr>
+        <w:t>3.2</w:t>
+      </w:r>
+    </w:p>
+    <w:p>
+      <w:pPr>
+        <w:spacing w:before="120" w:after="120" w:line="336" w:lineRule="auto"/>
+        <w:rPr>
+          <w:rFonts w:ascii="標楷體" w:eastAsia="標楷體" w:hAnsi="標楷體"/>
+        </w:rPr>
+      </w:pPr>
+    </w:p>
+    <w:p>
+      <w:pPr>
+        <w:spacing w:before="120" w:after="120" w:line="336" w:lineRule="auto"/>
+        <w:rPr>
+          <w:rFonts w:ascii="標楷體" w:eastAsia="標楷體" w:hAnsi="標楷體"/>
+        </w:rPr>
+      </w:pPr>
+      <w:r>
+        <w:rPr>
+          <w:rFonts w:ascii="Segoe UI Emoji" w:eastAsia="標楷體" w:hAnsi="Segoe UI Emoji" w:cs="Segoe UI Emoji"/>
+        </w:rPr>
+        <w:t>🚨</w:t>
+      </w:r>
+      <w:r>
+        <w:rPr>
+          <w:rFonts w:ascii="標楷體" w:eastAsia="標楷體" w:hAnsi="標楷體"/>
+        </w:rPr>
+        <w:t xml:space="preserve"> </w:t>
+      </w:r>
+      <w:r>
         <w:rPr>
           <w:rFonts w:ascii="標楷體" w:eastAsia="DengXian" w:hAnsi="標楷體" w:hint="eastAsia"/>
-          <w:lang w:eastAsia="zh-CN"/>
-        </w:rPr>
-      </w:pPr>
-    </w:p>
-    <w:p>
-      <w:pPr>
-        <w:spacing w:before="120" w:after="120" w:line="336" w:lineRule="auto"/>
-        <w:rPr>
-          <w:rFonts w:ascii="標楷體" w:eastAsia="標楷體" w:hAnsi="標楷體"/>
-        </w:rPr>
-      </w:pPr>
-      <w:r>
-        <w:rPr>
-          <w:rFonts w:ascii="Segoe UI Emoji" w:eastAsia="標楷體" w:hAnsi="Segoe UI Emoji" w:cs="Segoe UI Emoji"/>
-        </w:rPr>
-        <w:t>🚨</w:t>
-      </w:r>
-      <w:r>
-        <w:rPr>
-          <w:rFonts w:ascii="標楷體" w:eastAsia="標楷體" w:hAnsi="標楷體"/>
-        </w:rPr>
-        <w:t xml:space="preserve"> </w:t>
-      </w:r>
-      <w:r>
-        <w:rPr>
-          <w:rFonts w:ascii="標楷體" w:eastAsia="DengXian" w:hAnsi="標楷體" w:hint="eastAsia"/>
-        </w:rPr>
-        <w:t>2</w:t>
-      </w:r>
-      <w:r>
-        <w:rPr>
-          <w:rFonts w:ascii="標楷體" w:eastAsia="標楷體" w:hAnsi="標楷體"/>
-        </w:rPr>
-        <w:t>. SQL 關聯欄位名稱不匹配</w:t>
-      </w:r>
-    </w:p>
-    <w:p>
-      <w:pPr>
-        <w:spacing w:before="120" w:after="120" w:line="336" w:lineRule="auto"/>
-        <w:rPr>
-          <w:rFonts w:ascii="標楷體" w:eastAsia="DengXian" w:hAnsi="標楷體" w:hint="eastAsia"/>
-          <w:lang w:eastAsia="zh-CN"/>
-        </w:rPr>
-      </w:pPr>
-      <w:r>
-        <w:rPr>
-          <w:rFonts w:ascii="Segoe UI Emoji" w:eastAsia="標楷體" w:hAnsi="Segoe UI Emoji" w:cs="Segoe UI Emoji"/>
-        </w:rPr>
-        <w:t>🔍</w:t>
-      </w:r>
-      <w:r>
-        <w:rPr>
-          <w:rFonts w:ascii="標楷體" w:eastAsia="標楷體" w:hAnsi="標楷體"/>
-        </w:rPr>
-        <w:t xml:space="preserve"> 當時狀況：在撈取書籍資料時，PHP 報錯找不到欄位。</w:t>
-      </w:r>
-    </w:p>
-    <w:p>
-      <w:pPr>
-        <w:spacing w:before="120" w:after="120" w:line="336" w:lineRule="auto"/>
-        <w:rPr>
-          <w:rFonts w:ascii="標楷體" w:eastAsia="標楷體" w:hAnsi="標楷體"/>
-        </w:rPr>
-      </w:pPr>
-      <w:r>
-        <w:rPr>
-          <w:rFonts w:ascii="Segoe UI Emoji" w:eastAsia="標楷體" w:hAnsi="Segoe UI Emoji" w:cs="Segoe UI Emoji"/>
-        </w:rPr>
-        <w:t>💡</w:t>
-      </w:r>
-      <w:r>
-        <w:rPr>
-          <w:rFonts w:ascii="標楷體" w:eastAsia="標楷體" w:hAnsi="標楷體"/>
-        </w:rPr>
-        <w:t xml:space="preserve"> 解決方式：經核對 ER 圖與真實資料庫，發現 Book 表記錄捐贈者的欄位為 </w:t>
+        </w:rPr>
+        <w:t>3</w:t>
+      </w:r>
+      <w:r>
+        <w:rPr>
+          <w:rFonts w:ascii="標楷體" w:eastAsia="標楷體" w:hAnsi="標楷體"/>
+        </w:rPr>
+        <w:t>. 變數命名衝突 ($conn vs $</w:t>
       </w:r>
       <w:proofErr w:type="spellStart"/>
       <w:r>
         <w:rPr>
           <w:rFonts w:ascii="標楷體" w:eastAsia="標楷體" w:hAnsi="標楷體"/>
         </w:rPr>
-        <w:t>bdonor_id</w:t>
+        <w:t>pdo</w:t>
       </w:r>
       <w:proofErr w:type="spellEnd"/>
       <w:r>
         <w:rPr>
           <w:rFonts w:ascii="標楷體" w:eastAsia="標楷體" w:hAnsi="標楷體"/>
         </w:rPr>
-        <w:t xml:space="preserve">，而非原先預期的 </w:t>
-      </w:r>
-      <w:proofErr w:type="spellStart"/>
-      <w:r>
-        <w:rPr>
-          <w:rFonts w:ascii="標楷體" w:eastAsia="標楷體" w:hAnsi="標楷體"/>
-        </w:rPr>
-        <w:t>buser_id</w:t>
-      </w:r>
-      <w:proofErr w:type="spellEnd"/>
-      <w:r>
-        <w:rPr>
-          <w:rFonts w:ascii="標楷體" w:eastAsia="標楷體" w:hAnsi="標楷體"/>
-        </w:rPr>
-        <w:t>。修正 LEFT JOIN 語法後成功串接三張資料表。</w:t>
+        <w:t>)</w:t>
       </w:r>
     </w:p>
     <w:p>
@@ -6658,7 +6694,74 @@
         <w:rPr>
           <w:rFonts w:ascii="Segoe UI Emoji" w:eastAsia="標楷體" w:hAnsi="Segoe UI Emoji" w:cs="Segoe UI Emoji"/>
         </w:rPr>
-        <w:lastRenderedPageBreak/>
+        <w:t>🔍</w:t>
+      </w:r>
+      <w:r>
+        <w:rPr>
+          <w:rFonts w:ascii="標楷體" w:eastAsia="標楷體" w:hAnsi="標楷體"/>
+        </w:rPr>
+        <w:t xml:space="preserve"> 當時狀況：出現 Undefined variable $conn 與 Call to a member function prepare() on null 的致命錯誤。</w:t>
+      </w:r>
+    </w:p>
+    <w:p>
+      <w:pPr>
+        <w:spacing w:before="120" w:after="120" w:line="336" w:lineRule="auto"/>
+        <w:rPr>
+          <w:rFonts w:ascii="標楷體" w:eastAsia="標楷體" w:hAnsi="標楷體"/>
+        </w:rPr>
+      </w:pPr>
+      <w:r>
+        <w:rPr>
+          <w:rFonts w:ascii="Segoe UI Emoji" w:eastAsia="標楷體" w:hAnsi="Segoe UI Emoji" w:cs="Segoe UI Emoji"/>
+        </w:rPr>
+        <w:t>💡</w:t>
+      </w:r>
+      <w:r>
+        <w:rPr>
+          <w:rFonts w:ascii="標楷體" w:eastAsia="標楷體" w:hAnsi="標楷體"/>
+        </w:rPr>
+        <w:t xml:space="preserve"> 解決方式：追查發現 config/</w:t>
+      </w:r>
+      <w:proofErr w:type="spellStart"/>
+      <w:r>
+        <w:rPr>
+          <w:rFonts w:ascii="標楷體" w:eastAsia="標楷體" w:hAnsi="標楷體"/>
+        </w:rPr>
+        <w:t>database.php</w:t>
+      </w:r>
+      <w:proofErr w:type="spellEnd"/>
+      <w:r>
+        <w:rPr>
+          <w:rFonts w:ascii="標楷體" w:eastAsia="標楷體" w:hAnsi="標楷體"/>
+        </w:rPr>
+        <w:t xml:space="preserve"> 實例化 PDO 時使用了 $</w:t>
+      </w:r>
+      <w:proofErr w:type="spellStart"/>
+      <w:r>
+        <w:rPr>
+          <w:rFonts w:ascii="標楷體" w:eastAsia="標楷體" w:hAnsi="標楷體"/>
+        </w:rPr>
+        <w:t>pdo</w:t>
+      </w:r>
+      <w:proofErr w:type="spellEnd"/>
+      <w:r>
+        <w:rPr>
+          <w:rFonts w:ascii="標楷體" w:eastAsia="標楷體" w:hAnsi="標楷體"/>
+        </w:rPr>
+        <w:t>，但其他 API 呼叫時使用的是 $conn。將命名全站統一為 $conn 後，資料庫連線瞬間打通。</w:t>
+      </w:r>
+    </w:p>
+    <w:p>
+      <w:pPr>
+        <w:spacing w:before="120" w:after="120" w:line="336" w:lineRule="auto"/>
+        <w:rPr>
+          <w:rFonts w:ascii="標楷體" w:eastAsia="DengXian" w:hAnsi="標楷體"/>
+        </w:rPr>
+      </w:pPr>
+      <w:r>
+        <w:rPr>
+          <w:rFonts w:ascii="Segoe UI Emoji" w:eastAsia="標楷體" w:hAnsi="Segoe UI Emoji" w:cs="Segoe UI Emoji"/>
+        </w:rPr>
         <w:t>📌</w:t>
       </w:r>
       <w:r>
@@ -6670,7 +6773,6 @@
       <w:r>
         <w:rPr>
           <w:rFonts w:ascii="標楷體" w:eastAsia="DengXian" w:hAnsi="標楷體" w:hint="eastAsia"/>
-          <w:lang w:eastAsia="zh-CN"/>
         </w:rPr>
         <w:t>3.2</w:t>
       </w:r>
@@ -6679,7 +6781,7 @@
       <w:pPr>
         <w:spacing w:before="120" w:after="120" w:line="336" w:lineRule="auto"/>
         <w:rPr>
-          <w:rFonts w:ascii="標楷體" w:eastAsia="標楷體" w:hAnsi="標楷體"/>
+          <w:rFonts w:ascii="標楷體" w:eastAsia="DengXian" w:hAnsi="標楷體"/>
         </w:rPr>
       </w:pPr>
     </w:p>
@@ -6705,219 +6807,134 @@
       <w:r>
         <w:rPr>
           <w:rFonts w:ascii="標楷體" w:eastAsia="DengXian" w:hAnsi="標楷體" w:hint="eastAsia"/>
-          <w:lang w:eastAsia="zh-CN"/>
-        </w:rPr>
-        <w:t>3</w:t>
-      </w:r>
-      <w:r>
-        <w:rPr>
-          <w:rFonts w:ascii="標楷體" w:eastAsia="標楷體" w:hAnsi="標楷體"/>
-        </w:rPr>
-        <w:t>. 變數命名衝突 ($conn vs $</w:t>
-      </w:r>
-      <w:proofErr w:type="spellStart"/>
-      <w:r>
-        <w:rPr>
-          <w:rFonts w:ascii="標楷體" w:eastAsia="標楷體" w:hAnsi="標楷體"/>
-        </w:rPr>
-        <w:t>pdo</w:t>
-      </w:r>
-      <w:proofErr w:type="spellEnd"/>
-      <w:r>
-        <w:rPr>
-          <w:rFonts w:ascii="標楷體" w:eastAsia="標楷體" w:hAnsi="標楷體"/>
-        </w:rPr>
-        <w:t>)</w:t>
-      </w:r>
-    </w:p>
-    <w:p>
-      <w:pPr>
-        <w:spacing w:before="120" w:after="120" w:line="336" w:lineRule="auto"/>
+        </w:rPr>
+        <w:t>4</w:t>
+      </w:r>
+      <w:r>
+        <w:rPr>
+          <w:rFonts w:ascii="標楷體" w:eastAsia="標楷體" w:hAnsi="標楷體"/>
+        </w:rPr>
+        <w:t>. 資料庫 Emoji 支援與字元集設定</w:t>
+      </w:r>
+    </w:p>
+    <w:p>
+      <w:pPr>
+        <w:spacing w:before="120" w:after="120" w:line="336" w:lineRule="auto"/>
+        <w:rPr>
+          <w:rFonts w:ascii="標楷體" w:eastAsia="DengXian" w:hAnsi="標楷體"/>
+        </w:rPr>
+      </w:pPr>
+      <w:r>
+        <w:rPr>
+          <w:rFonts w:ascii="Segoe UI Emoji" w:eastAsia="標楷體" w:hAnsi="Segoe UI Emoji" w:cs="Segoe UI Emoji"/>
+        </w:rPr>
+        <w:t>🔍</w:t>
+      </w:r>
+      <w:r>
+        <w:rPr>
+          <w:rFonts w:ascii="標楷體" w:eastAsia="標楷體" w:hAnsi="標楷體"/>
+        </w:rPr>
+        <w:t xml:space="preserve"> 當時狀況：建置資料庫時，字元集（Charset）預設選擇了 utf8。</w:t>
+      </w:r>
+    </w:p>
+    <w:p>
+      <w:pPr>
+        <w:spacing w:before="120" w:after="120" w:line="336" w:lineRule="auto"/>
+        <w:rPr>
+          <w:rFonts w:ascii="標楷體" w:eastAsia="標楷體" w:hAnsi="標楷體"/>
+        </w:rPr>
+      </w:pPr>
+      <w:r>
+        <w:rPr>
+          <w:rFonts w:ascii="Segoe UI Emoji" w:eastAsia="標楷體" w:hAnsi="Segoe UI Emoji" w:cs="Segoe UI Emoji"/>
+        </w:rPr>
+        <w:t>💡</w:t>
+      </w:r>
+      <w:r>
+        <w:rPr>
+          <w:rFonts w:ascii="標楷體" w:eastAsia="標楷體" w:hAnsi="標楷體"/>
+        </w:rPr>
+        <w:t xml:space="preserve"> 解決方式：將其修正為 utf8mb4。因為 MySQL 的 utf8 只支援 3 </w:t>
+      </w:r>
+      <w:proofErr w:type="gramStart"/>
+      <w:r>
+        <w:rPr>
+          <w:rFonts w:ascii="標楷體" w:eastAsia="標楷體" w:hAnsi="標楷體"/>
+        </w:rPr>
+        <w:t>個</w:t>
+      </w:r>
+      <w:proofErr w:type="gramEnd"/>
+      <w:r>
+        <w:rPr>
+          <w:rFonts w:ascii="標楷體" w:eastAsia="標楷體" w:hAnsi="標楷體"/>
+        </w:rPr>
+        <w:t>位元組，無法儲存現代的 Emoji 表情符號；改用 utf8mb4 確保了全站互動留言的相容性。</w:t>
+      </w:r>
+    </w:p>
+    <w:p>
+      <w:pPr>
+        <w:spacing w:before="120" w:after="120" w:line="336" w:lineRule="auto"/>
+        <w:rPr>
+          <w:rFonts w:ascii="標楷體" w:eastAsia="DengXian" w:hAnsi="標楷體"/>
+        </w:rPr>
+      </w:pPr>
+      <w:r>
+        <w:rPr>
+          <w:rFonts w:ascii="Segoe UI Emoji" w:eastAsia="標楷體" w:hAnsi="Segoe UI Emoji" w:cs="Segoe UI Emoji"/>
+        </w:rPr>
+        <w:t>📌</w:t>
+      </w:r>
+      <w:r>
+        <w:rPr>
+          <w:rFonts w:ascii="標楷體" w:eastAsia="標楷體" w:hAnsi="標楷體"/>
+        </w:rPr>
+        <w:t xml:space="preserve"> 對應版本：v0.</w:t>
+      </w:r>
+      <w:r>
         <w:rPr>
           <w:rFonts w:ascii="標楷體" w:eastAsia="DengXian" w:hAnsi="標楷體" w:hint="eastAsia"/>
-          <w:lang w:eastAsia="zh-CN"/>
-        </w:rPr>
-      </w:pPr>
-      <w:r>
-        <w:rPr>
-          <w:rFonts w:ascii="Segoe UI Emoji" w:eastAsia="標楷體" w:hAnsi="Segoe UI Emoji" w:cs="Segoe UI Emoji"/>
-        </w:rPr>
-        <w:t>🔍</w:t>
-      </w:r>
-      <w:r>
-        <w:rPr>
-          <w:rFonts w:ascii="標楷體" w:eastAsia="標楷體" w:hAnsi="標楷體"/>
-        </w:rPr>
-        <w:t xml:space="preserve"> 當時狀況：出現 Undefined variable $conn 與 Call to a member function prepare() on null 的致命錯誤。</w:t>
-      </w:r>
-    </w:p>
-    <w:p>
-      <w:pPr>
-        <w:spacing w:before="120" w:after="120" w:line="336" w:lineRule="auto"/>
-        <w:rPr>
-          <w:rFonts w:ascii="標楷體" w:eastAsia="標楷體" w:hAnsi="標楷體"/>
-        </w:rPr>
-      </w:pPr>
-      <w:r>
-        <w:rPr>
-          <w:rFonts w:ascii="Segoe UI Emoji" w:eastAsia="標楷體" w:hAnsi="Segoe UI Emoji" w:cs="Segoe UI Emoji"/>
-        </w:rPr>
-        <w:t>💡</w:t>
-      </w:r>
-      <w:r>
-        <w:rPr>
-          <w:rFonts w:ascii="標楷體" w:eastAsia="標楷體" w:hAnsi="標楷體"/>
-        </w:rPr>
-        <w:t xml:space="preserve"> 解決方式：追查發現 config/</w:t>
-      </w:r>
-      <w:proofErr w:type="spellStart"/>
-      <w:r>
-        <w:rPr>
-          <w:rFonts w:ascii="標楷體" w:eastAsia="標楷體" w:hAnsi="標楷體"/>
-        </w:rPr>
-        <w:t>database.php</w:t>
-      </w:r>
-      <w:proofErr w:type="spellEnd"/>
-      <w:r>
-        <w:rPr>
-          <w:rFonts w:ascii="標楷體" w:eastAsia="標楷體" w:hAnsi="標楷體"/>
-        </w:rPr>
-        <w:t xml:space="preserve"> 實例化 PDO 時使用了 $</w:t>
-      </w:r>
-      <w:proofErr w:type="spellStart"/>
-      <w:r>
-        <w:rPr>
-          <w:rFonts w:ascii="標楷體" w:eastAsia="標楷體" w:hAnsi="標楷體"/>
-        </w:rPr>
-        <w:t>pdo</w:t>
-      </w:r>
-      <w:proofErr w:type="spellEnd"/>
-      <w:r>
-        <w:rPr>
-          <w:rFonts w:ascii="標楷體" w:eastAsia="標楷體" w:hAnsi="標楷體"/>
-        </w:rPr>
-        <w:t>，但其他 API 呼叫時使用的是 $conn。將命名全站統一為 $conn 後，資料庫連線瞬間打通。</w:t>
-      </w:r>
-    </w:p>
-    <w:p>
-      <w:pPr>
-        <w:spacing w:before="120" w:after="120" w:line="336" w:lineRule="auto"/>
+        </w:rPr>
+        <w:t>3.3</w:t>
+      </w:r>
+    </w:p>
+    <w:p>
+      <w:pPr>
+        <w:spacing w:before="120" w:after="120" w:line="336" w:lineRule="auto"/>
+        <w:rPr>
+          <w:rFonts w:ascii="標楷體" w:eastAsia="DengXian" w:hAnsi="標楷體"/>
+        </w:rPr>
+      </w:pPr>
+    </w:p>
+    <w:p>
+      <w:pPr>
+        <w:spacing w:before="120" w:after="120" w:line="336" w:lineRule="auto"/>
+        <w:rPr>
+          <w:rFonts w:ascii="標楷體" w:eastAsia="標楷體" w:hAnsi="標楷體"/>
+        </w:rPr>
+      </w:pPr>
+      <w:r>
+        <w:rPr>
+          <w:rFonts w:ascii="Segoe UI Emoji" w:eastAsia="標楷體" w:hAnsi="Segoe UI Emoji" w:cs="Segoe UI Emoji"/>
+        </w:rPr>
+        <w:t>🚨</w:t>
+      </w:r>
+      <w:r>
+        <w:rPr>
+          <w:rFonts w:ascii="標楷體" w:eastAsia="標楷體" w:hAnsi="標楷體"/>
+        </w:rPr>
+        <w:t xml:space="preserve"> </w:t>
+      </w:r>
+      <w:r>
         <w:rPr>
           <w:rFonts w:ascii="標楷體" w:eastAsia="DengXian" w:hAnsi="標楷體" w:hint="eastAsia"/>
         </w:rPr>
-      </w:pPr>
-      <w:r>
-        <w:rPr>
-          <w:rFonts w:ascii="Segoe UI Emoji" w:eastAsia="標楷體" w:hAnsi="Segoe UI Emoji" w:cs="Segoe UI Emoji"/>
-        </w:rPr>
-        <w:t>📌</w:t>
-      </w:r>
-      <w:r>
-        <w:rPr>
-          <w:rFonts w:ascii="標楷體" w:eastAsia="標楷體" w:hAnsi="標楷體"/>
-        </w:rPr>
-        <w:t xml:space="preserve"> 對應版本：v0.</w:t>
-      </w:r>
-      <w:r>
-        <w:rPr>
-          <w:rFonts w:ascii="標楷體" w:eastAsia="DengXian" w:hAnsi="標楷體" w:hint="eastAsia"/>
-        </w:rPr>
-        <w:t>3.2</w:t>
-      </w:r>
-    </w:p>
-    <w:p>
-      <w:pPr>
-        <w:spacing w:before="120" w:after="120" w:line="336" w:lineRule="auto"/>
-        <w:rPr>
-          <w:rFonts w:ascii="標楷體" w:eastAsia="DengXian" w:hAnsi="標楷體" w:hint="eastAsia"/>
-          <w:lang w:eastAsia="zh-CN"/>
-        </w:rPr>
-      </w:pPr>
-    </w:p>
-    <w:p>
-      <w:pPr>
-        <w:spacing w:before="120" w:after="120" w:line="336" w:lineRule="auto"/>
-        <w:rPr>
-          <w:rFonts w:ascii="標楷體" w:eastAsia="標楷體" w:hAnsi="標楷體"/>
-        </w:rPr>
-      </w:pPr>
-      <w:r>
-        <w:rPr>
-          <w:rFonts w:ascii="Segoe UI Emoji" w:eastAsia="標楷體" w:hAnsi="Segoe UI Emoji" w:cs="Segoe UI Emoji"/>
-        </w:rPr>
-        <w:t>🚨</w:t>
-      </w:r>
-      <w:r>
-        <w:rPr>
-          <w:rFonts w:ascii="標楷體" w:eastAsia="標楷體" w:hAnsi="標楷體"/>
-        </w:rPr>
-        <w:t xml:space="preserve"> </w:t>
-      </w:r>
-      <w:r>
-        <w:rPr>
-          <w:rFonts w:ascii="標楷體" w:eastAsia="DengXian" w:hAnsi="標楷體" w:hint="eastAsia"/>
-        </w:rPr>
-        <w:t>4</w:t>
-      </w:r>
-      <w:r>
-        <w:rPr>
-          <w:rFonts w:ascii="標楷體" w:eastAsia="標楷體" w:hAnsi="標楷體"/>
-        </w:rPr>
-        <w:t>. 資料庫 Emoji 支援與字元集設定</w:t>
-      </w:r>
-    </w:p>
-    <w:p>
-      <w:pPr>
-        <w:spacing w:before="120" w:after="120" w:line="336" w:lineRule="auto"/>
-        <w:rPr>
-          <w:rFonts w:ascii="標楷體" w:eastAsia="DengXian" w:hAnsi="標楷體" w:hint="eastAsia"/>
-        </w:rPr>
-      </w:pPr>
-      <w:r>
-        <w:rPr>
-          <w:rFonts w:ascii="Segoe UI Emoji" w:eastAsia="標楷體" w:hAnsi="Segoe UI Emoji" w:cs="Segoe UI Emoji"/>
-        </w:rPr>
-        <w:t>🔍</w:t>
-      </w:r>
-      <w:r>
-        <w:rPr>
-          <w:rFonts w:ascii="標楷體" w:eastAsia="標楷體" w:hAnsi="標楷體"/>
-        </w:rPr>
-        <w:t xml:space="preserve"> 當時狀況：建置資料庫時，字元集（Charset）預設選擇了 utf8。</w:t>
-      </w:r>
-    </w:p>
-    <w:p>
-      <w:pPr>
-        <w:spacing w:before="120" w:after="120" w:line="336" w:lineRule="auto"/>
-        <w:rPr>
-          <w:rFonts w:ascii="標楷體" w:eastAsia="標楷體" w:hAnsi="標楷體"/>
-        </w:rPr>
-      </w:pPr>
-      <w:r>
-        <w:rPr>
-          <w:rFonts w:ascii="Segoe UI Emoji" w:eastAsia="標楷體" w:hAnsi="Segoe UI Emoji" w:cs="Segoe UI Emoji"/>
-        </w:rPr>
-        <w:t>💡</w:t>
-      </w:r>
-      <w:r>
-        <w:rPr>
-          <w:rFonts w:ascii="標楷體" w:eastAsia="標楷體" w:hAnsi="標楷體"/>
-        </w:rPr>
-        <w:t xml:space="preserve"> 解決方式：將其修正為 utf8mb4。因為 MySQL 的 utf8 只支援 3 </w:t>
-      </w:r>
-      <w:proofErr w:type="gramStart"/>
-      <w:r>
-        <w:rPr>
-          <w:rFonts w:ascii="標楷體" w:eastAsia="標楷體" w:hAnsi="標楷體"/>
-        </w:rPr>
-        <w:t>個</w:t>
-      </w:r>
-      <w:proofErr w:type="gramEnd"/>
-      <w:r>
-        <w:rPr>
-          <w:rFonts w:ascii="標楷體" w:eastAsia="標楷體" w:hAnsi="標楷體"/>
-        </w:rPr>
-        <w:t>位元組，無法儲存現代的 Emoji 表情符號；改用 utf8mb4 確保了全站互動留言的相容性。</w:t>
+        <w:t>5</w:t>
+      </w:r>
+      <w:r>
+        <w:rPr>
+          <w:rFonts w:ascii="標楷體" w:eastAsia="標楷體" w:hAnsi="標楷體"/>
+        </w:rPr>
+        <w:t>. BCRYPT 密碼加密與登入失敗</w:t>
       </w:r>
     </w:p>
     <w:p>
@@ -6932,184 +6949,113 @@
         <w:rPr>
           <w:rFonts w:ascii="Segoe UI Emoji" w:eastAsia="標楷體" w:hAnsi="Segoe UI Emoji" w:cs="Segoe UI Emoji"/>
         </w:rPr>
+        <w:t>🔍</w:t>
+      </w:r>
+      <w:r>
+        <w:rPr>
+          <w:rFonts w:ascii="標楷體" w:eastAsia="標楷體" w:hAnsi="標楷體"/>
+        </w:rPr>
+        <w:t xml:space="preserve"> 當時狀況：User 資料表中儲存了明文密碼 123456，導致 </w:t>
+      </w:r>
+      <w:proofErr w:type="spellStart"/>
+      <w:r>
+        <w:rPr>
+          <w:rFonts w:ascii="標楷體" w:eastAsia="標楷體" w:hAnsi="標楷體"/>
+        </w:rPr>
+        <w:t>auth_process.php</w:t>
+      </w:r>
+      <w:proofErr w:type="spellEnd"/>
+      <w:r>
+        <w:rPr>
+          <w:rFonts w:ascii="標楷體" w:eastAsia="標楷體" w:hAnsi="標楷體"/>
+        </w:rPr>
+        <w:t xml:space="preserve"> 中的 </w:t>
+      </w:r>
+      <w:proofErr w:type="spellStart"/>
+      <w:r>
+        <w:rPr>
+          <w:rFonts w:ascii="標楷體" w:eastAsia="標楷體" w:hAnsi="標楷體"/>
+        </w:rPr>
+        <w:t>password_verify</w:t>
+      </w:r>
+      <w:proofErr w:type="spellEnd"/>
+      <w:r>
+        <w:rPr>
+          <w:rFonts w:ascii="標楷體" w:eastAsia="標楷體" w:hAnsi="標楷體"/>
+        </w:rPr>
+        <w:t>() 函數永遠驗證失敗。</w:t>
+      </w:r>
+    </w:p>
+    <w:p>
+      <w:pPr>
+        <w:spacing w:before="120" w:after="120" w:line="336" w:lineRule="auto"/>
+        <w:rPr>
+          <w:rFonts w:ascii="標楷體" w:eastAsia="DengXian" w:hAnsi="標楷體"/>
+        </w:rPr>
+      </w:pPr>
+      <w:r>
+        <w:rPr>
+          <w:rFonts w:ascii="Segoe UI Emoji" w:eastAsia="標楷體" w:hAnsi="Segoe UI Emoji" w:cs="Segoe UI Emoji"/>
+        </w:rPr>
+        <w:t>💡</w:t>
+      </w:r>
+      <w:r>
+        <w:rPr>
+          <w:rFonts w:ascii="標楷體" w:eastAsia="標楷體" w:hAnsi="標楷體"/>
+        </w:rPr>
+        <w:t xml:space="preserve"> 解決方式：不在資料庫儲存明文。為 123456 產出一組共用的 BCRYPT 雜湊字串</w:t>
+      </w:r>
+      <w:proofErr w:type="gramStart"/>
+      <w:r>
+        <w:rPr>
+          <w:rFonts w:ascii="標楷體" w:eastAsia="標楷體" w:hAnsi="標楷體"/>
+        </w:rPr>
+        <w:t>（</w:t>
+      </w:r>
+      <w:proofErr w:type="gramEnd"/>
+      <w:r>
+        <w:rPr>
+          <w:rFonts w:ascii="標楷體" w:eastAsia="標楷體" w:hAnsi="標楷體"/>
+        </w:rPr>
+        <w:t xml:space="preserve">$2y$10$...），並將其統一寫入團隊共用的 </w:t>
+      </w:r>
+      <w:proofErr w:type="spellStart"/>
+      <w:r>
+        <w:rPr>
+          <w:rFonts w:ascii="標楷體" w:eastAsia="標楷體" w:hAnsi="標楷體"/>
+        </w:rPr>
+        <w:t>data.sql</w:t>
+      </w:r>
+      <w:proofErr w:type="spellEnd"/>
+      <w:r>
+        <w:rPr>
+          <w:rFonts w:ascii="標楷體" w:eastAsia="標楷體" w:hAnsi="標楷體"/>
+        </w:rPr>
+        <w:t xml:space="preserve"> 中。</w:t>
+      </w:r>
+    </w:p>
+    <w:p>
+      <w:pPr>
+        <w:spacing w:before="120" w:after="120" w:line="336" w:lineRule="auto"/>
+        <w:rPr>
+          <w:rFonts w:ascii="標楷體" w:eastAsia="DengXian" w:hAnsi="標楷體"/>
+        </w:rPr>
+      </w:pPr>
+      <w:r>
+        <w:rPr>
+          <w:rFonts w:ascii="Segoe UI Emoji" w:eastAsia="標楷體" w:hAnsi="Segoe UI Emoji" w:cs="Segoe UI Emoji"/>
+        </w:rPr>
         <w:t>📌</w:t>
       </w:r>
       <w:r>
         <w:rPr>
           <w:rFonts w:ascii="標楷體" w:eastAsia="標楷體" w:hAnsi="標楷體"/>
         </w:rPr>
-        <w:t xml:space="preserve"> 對應版本：v0.</w:t>
+        <w:t xml:space="preserve"> 對應版本：v0.3.</w:t>
       </w:r>
       <w:r>
         <w:rPr>
           <w:rFonts w:ascii="標楷體" w:eastAsia="DengXian" w:hAnsi="標楷體" w:hint="eastAsia"/>
-          <w:lang w:eastAsia="zh-CN"/>
-        </w:rPr>
-        <w:t>3.3</w:t>
-      </w:r>
-    </w:p>
-    <w:p>
-      <w:pPr>
-        <w:spacing w:before="120" w:after="120" w:line="336" w:lineRule="auto"/>
-        <w:rPr>
-          <w:rFonts w:ascii="標楷體" w:eastAsia="DengXian" w:hAnsi="標楷體" w:hint="eastAsia"/>
-        </w:rPr>
-      </w:pPr>
-    </w:p>
-    <w:p>
-      <w:pPr>
-        <w:spacing w:before="120" w:after="120" w:line="336" w:lineRule="auto"/>
-        <w:rPr>
-          <w:rFonts w:ascii="標楷體" w:eastAsia="標楷體" w:hAnsi="標楷體"/>
-        </w:rPr>
-      </w:pPr>
-      <w:r>
-        <w:rPr>
-          <w:rFonts w:ascii="Segoe UI Emoji" w:eastAsia="標楷體" w:hAnsi="Segoe UI Emoji" w:cs="Segoe UI Emoji"/>
-        </w:rPr>
-        <w:t>🚨</w:t>
-      </w:r>
-      <w:r>
-        <w:rPr>
-          <w:rFonts w:ascii="標楷體" w:eastAsia="標楷體" w:hAnsi="標楷體"/>
-        </w:rPr>
-        <w:t xml:space="preserve"> </w:t>
-      </w:r>
-      <w:r>
-        <w:rPr>
-          <w:rFonts w:ascii="標楷體" w:eastAsia="DengXian" w:hAnsi="標楷體" w:hint="eastAsia"/>
-        </w:rPr>
-        <w:t>5</w:t>
-      </w:r>
-      <w:r>
-        <w:rPr>
-          <w:rFonts w:ascii="標楷體" w:eastAsia="標楷體" w:hAnsi="標楷體"/>
-        </w:rPr>
-        <w:t>. BCRYPT 密碼加密與登入失敗</w:t>
-      </w:r>
-    </w:p>
-    <w:p>
-      <w:pPr>
-        <w:spacing w:before="120" w:after="120" w:line="336" w:lineRule="auto"/>
-        <w:rPr>
-          <w:rFonts w:ascii="標楷體" w:eastAsia="DengXian" w:hAnsi="標楷體" w:hint="eastAsia"/>
-          <w:lang w:eastAsia="zh-CN"/>
-        </w:rPr>
-      </w:pPr>
-      <w:r>
-        <w:rPr>
-          <w:rFonts w:ascii="Segoe UI Emoji" w:eastAsia="標楷體" w:hAnsi="Segoe UI Emoji" w:cs="Segoe UI Emoji"/>
-        </w:rPr>
-        <w:t>🔍</w:t>
-      </w:r>
-      <w:r>
-        <w:rPr>
-          <w:rFonts w:ascii="標楷體" w:eastAsia="標楷體" w:hAnsi="標楷體"/>
-        </w:rPr>
-        <w:t xml:space="preserve"> 當時狀況：User 資料表中儲存了明文密碼 123456，導致 </w:t>
-      </w:r>
-      <w:proofErr w:type="spellStart"/>
-      <w:r>
-        <w:rPr>
-          <w:rFonts w:ascii="標楷體" w:eastAsia="標楷體" w:hAnsi="標楷體"/>
-        </w:rPr>
-        <w:t>auth_process.php</w:t>
-      </w:r>
-      <w:proofErr w:type="spellEnd"/>
-      <w:r>
-        <w:rPr>
-          <w:rFonts w:ascii="標楷體" w:eastAsia="標楷體" w:hAnsi="標楷體"/>
-        </w:rPr>
-        <w:t xml:space="preserve"> 中的 </w:t>
-      </w:r>
-      <w:proofErr w:type="spellStart"/>
-      <w:r>
-        <w:rPr>
-          <w:rFonts w:ascii="標楷體" w:eastAsia="標楷體" w:hAnsi="標楷體"/>
-        </w:rPr>
-        <w:t>password_verify</w:t>
-      </w:r>
-      <w:proofErr w:type="spellEnd"/>
-      <w:r>
-        <w:rPr>
-          <w:rFonts w:ascii="標楷體" w:eastAsia="標楷體" w:hAnsi="標楷體"/>
-        </w:rPr>
-        <w:t>() 函數永遠驗證失敗。</w:t>
-      </w:r>
-    </w:p>
-    <w:p>
-      <w:pPr>
-        <w:spacing w:before="120" w:after="120" w:line="336" w:lineRule="auto"/>
-        <w:rPr>
-          <w:rFonts w:ascii="標楷體" w:eastAsia="DengXian" w:hAnsi="標楷體" w:hint="eastAsia"/>
-          <w:lang w:eastAsia="zh-CN"/>
-        </w:rPr>
-      </w:pPr>
-      <w:r>
-        <w:rPr>
-          <w:rFonts w:ascii="Segoe UI Emoji" w:eastAsia="標楷體" w:hAnsi="Segoe UI Emoji" w:cs="Segoe UI Emoji"/>
-        </w:rPr>
-        <w:t>💡</w:t>
-      </w:r>
-      <w:r>
-        <w:rPr>
-          <w:rFonts w:ascii="標楷體" w:eastAsia="標楷體" w:hAnsi="標楷體"/>
-        </w:rPr>
-        <w:t xml:space="preserve"> 解決方式：不在資料庫儲存明文。為 123456 產出一組共用的 BCRYPT 雜湊字串</w:t>
-      </w:r>
-      <w:proofErr w:type="gramStart"/>
-      <w:r>
-        <w:rPr>
-          <w:rFonts w:ascii="標楷體" w:eastAsia="標楷體" w:hAnsi="標楷體"/>
-        </w:rPr>
-        <w:t>（</w:t>
-      </w:r>
-      <w:proofErr w:type="gramEnd"/>
-      <w:r>
-        <w:rPr>
-          <w:rFonts w:ascii="標楷體" w:eastAsia="標楷體" w:hAnsi="標楷體"/>
-        </w:rPr>
-        <w:t xml:space="preserve">$2y$10$...），並將其統一寫入團隊共用的 </w:t>
-      </w:r>
-      <w:proofErr w:type="spellStart"/>
-      <w:r>
-        <w:rPr>
-          <w:rFonts w:ascii="標楷體" w:eastAsia="標楷體" w:hAnsi="標楷體"/>
-        </w:rPr>
-        <w:t>data.sql</w:t>
-      </w:r>
-      <w:proofErr w:type="spellEnd"/>
-      <w:r>
-        <w:rPr>
-          <w:rFonts w:ascii="標楷體" w:eastAsia="標楷體" w:hAnsi="標楷體"/>
-        </w:rPr>
-        <w:t xml:space="preserve"> 中。</w:t>
-      </w:r>
-    </w:p>
-    <w:p>
-      <w:pPr>
-        <w:spacing w:before="120" w:after="120" w:line="336" w:lineRule="auto"/>
-        <w:rPr>
-          <w:rFonts w:ascii="標楷體" w:eastAsia="DengXian" w:hAnsi="標楷體" w:hint="eastAsia"/>
-          <w:lang w:eastAsia="zh-CN"/>
-        </w:rPr>
-      </w:pPr>
-      <w:r>
-        <w:rPr>
-          <w:rFonts w:ascii="Segoe UI Emoji" w:eastAsia="標楷體" w:hAnsi="Segoe UI Emoji" w:cs="Segoe UI Emoji"/>
-        </w:rPr>
-        <w:t>📌</w:t>
-      </w:r>
-      <w:r>
-        <w:rPr>
-          <w:rFonts w:ascii="標楷體" w:eastAsia="標楷體" w:hAnsi="標楷體"/>
-        </w:rPr>
-        <w:t xml:space="preserve"> 對應版本：v0.3.</w:t>
-      </w:r>
-      <w:r>
-        <w:rPr>
-          <w:rFonts w:ascii="標楷體" w:eastAsia="DengXian" w:hAnsi="標楷體" w:hint="eastAsia"/>
-          <w:lang w:eastAsia="zh-CN"/>
         </w:rPr>
         <w:t>3</w:t>
       </w:r>
@@ -7118,8 +7064,7 @@
       <w:pPr>
         <w:spacing w:before="120" w:after="120" w:line="336" w:lineRule="auto"/>
         <w:rPr>
-          <w:rFonts w:ascii="標楷體" w:eastAsia="DengXian" w:hAnsi="標楷體" w:hint="eastAsia"/>
-          <w:lang w:eastAsia="zh-CN"/>
+          <w:rFonts w:ascii="標楷體" w:eastAsia="DengXian" w:hAnsi="標楷體"/>
         </w:rPr>
       </w:pPr>
     </w:p>
@@ -7148,8 +7093,219 @@
       <w:pPr>
         <w:spacing w:before="120" w:after="120" w:line="336" w:lineRule="auto"/>
         <w:rPr>
+          <w:rFonts w:ascii="標楷體" w:eastAsia="DengXian" w:hAnsi="標楷體"/>
+          <w:lang w:eastAsia="zh-CN"/>
+        </w:rPr>
+      </w:pPr>
+      <w:r>
+        <w:rPr>
+          <w:rFonts w:ascii="Segoe UI Emoji" w:eastAsia="標楷體" w:hAnsi="Segoe UI Emoji" w:cs="Segoe UI Emoji"/>
+        </w:rPr>
+        <w:t>🔍</w:t>
+      </w:r>
+      <w:r>
+        <w:rPr>
+          <w:rFonts w:ascii="標楷體" w:eastAsia="標楷體" w:hAnsi="標楷體"/>
+        </w:rPr>
+        <w:t xml:space="preserve"> 當時狀況：註冊新帳號時報錯 Unknown column 'status' in 'field list'。</w:t>
+      </w:r>
+    </w:p>
+    <w:p>
+      <w:pPr>
+        <w:spacing w:before="120" w:after="120" w:line="336" w:lineRule="auto"/>
+        <w:rPr>
+          <w:rFonts w:ascii="標楷體" w:eastAsia="DengXian" w:hAnsi="標楷體"/>
+          <w:lang w:eastAsia="zh-CN"/>
+        </w:rPr>
+      </w:pPr>
+      <w:r>
+        <w:rPr>
+          <w:rFonts w:ascii="Segoe UI Emoji" w:eastAsia="標楷體" w:hAnsi="Segoe UI Emoji" w:cs="Segoe UI Emoji"/>
+        </w:rPr>
+        <w:t>💡</w:t>
+      </w:r>
+      <w:r>
+        <w:rPr>
+          <w:rFonts w:ascii="標楷體" w:eastAsia="標楷體" w:hAnsi="標楷體"/>
+        </w:rPr>
+        <w:t xml:space="preserve"> 解決方式：為了支援管理員的「停權防護機制」，使用 SQL 指令 ALTER TABLE User ADD COLUMN status VARCHAR(20) NOT NULL DEFAULT 'active'; 擴充資料表，並同步更新</w:t>
+      </w:r>
+      <w:proofErr w:type="gramStart"/>
+      <w:r>
+        <w:rPr>
+          <w:rFonts w:ascii="標楷體" w:eastAsia="標楷體" w:hAnsi="標楷體"/>
+        </w:rPr>
+        <w:t>了建表腳本</w:t>
+      </w:r>
+      <w:proofErr w:type="gramEnd"/>
+      <w:r>
+        <w:rPr>
+          <w:rFonts w:ascii="標楷體" w:eastAsia="標楷體" w:hAnsi="標楷體"/>
+        </w:rPr>
+        <w:t>。</w:t>
+      </w:r>
+    </w:p>
+    <w:p>
+      <w:pPr>
+        <w:spacing w:before="120" w:after="120" w:line="336" w:lineRule="auto"/>
+        <w:rPr>
+          <w:rFonts w:ascii="標楷體" w:eastAsia="標楷體" w:hAnsi="標楷體"/>
+        </w:rPr>
+      </w:pPr>
+      <w:r>
+        <w:rPr>
+          <w:rFonts w:ascii="Segoe UI Emoji" w:eastAsia="標楷體" w:hAnsi="Segoe UI Emoji" w:cs="Segoe UI Emoji"/>
+        </w:rPr>
+        <w:t>📌</w:t>
+      </w:r>
+      <w:r>
+        <w:rPr>
+          <w:rFonts w:ascii="標楷體" w:eastAsia="標楷體" w:hAnsi="標楷體"/>
+        </w:rPr>
+        <w:t xml:space="preserve"> 對應版本：v0.3.3</w:t>
+      </w:r>
+    </w:p>
+    <w:p>
+      <w:pPr>
+        <w:spacing w:before="120" w:after="120" w:line="336" w:lineRule="auto"/>
+        <w:rPr>
+          <w:rFonts w:ascii="標楷體" w:eastAsia="標楷體" w:hAnsi="標楷體"/>
+        </w:rPr>
+      </w:pPr>
+    </w:p>
+    <w:p>
+      <w:pPr>
+        <w:spacing w:before="120" w:after="120" w:line="336" w:lineRule="auto"/>
+        <w:rPr>
+          <w:rFonts w:ascii="標楷體" w:eastAsia="標楷體" w:hAnsi="標楷體"/>
+        </w:rPr>
+      </w:pPr>
+      <w:r>
+        <w:rPr>
+          <w:rFonts w:ascii="Segoe UI Emoji" w:eastAsia="標楷體" w:hAnsi="Segoe UI Emoji" w:cs="Segoe UI Emoji"/>
+        </w:rPr>
+        <w:t>🚨</w:t>
+      </w:r>
+      <w:r>
+        <w:rPr>
+          <w:rFonts w:ascii="標楷體" w:eastAsia="標楷體" w:hAnsi="標楷體"/>
+        </w:rPr>
+        <w:t xml:space="preserve"> 7. AUTO_INCREMENT 計數器未歸零</w:t>
+      </w:r>
+    </w:p>
+    <w:p>
+      <w:pPr>
+        <w:spacing w:before="120" w:after="120" w:line="336" w:lineRule="auto"/>
+        <w:rPr>
+          <w:rFonts w:ascii="標楷體" w:eastAsia="DengXian" w:hAnsi="標楷體"/>
+        </w:rPr>
+      </w:pPr>
+      <w:r>
+        <w:rPr>
+          <w:rFonts w:ascii="Segoe UI Emoji" w:eastAsia="標楷體" w:hAnsi="Segoe UI Emoji" w:cs="Segoe UI Emoji"/>
+        </w:rPr>
+        <w:t>🔍</w:t>
+      </w:r>
+      <w:r>
+        <w:rPr>
+          <w:rFonts w:ascii="標楷體" w:eastAsia="標楷體" w:hAnsi="標楷體"/>
+        </w:rPr>
+        <w:t xml:space="preserve"> 當時狀況：刪除測試資料後，新註冊的帳號 ID 直接跳到 5，導致與現有書籍的 </w:t>
+      </w:r>
+      <w:proofErr w:type="spellStart"/>
+      <w:r>
+        <w:rPr>
+          <w:rFonts w:ascii="標楷體" w:eastAsia="標楷體" w:hAnsi="標楷體"/>
+        </w:rPr>
+        <w:t>bdonor_id</w:t>
+      </w:r>
+      <w:proofErr w:type="spellEnd"/>
+      <w:r>
+        <w:rPr>
+          <w:rFonts w:ascii="標楷體" w:eastAsia="標楷體" w:hAnsi="標楷體"/>
+        </w:rPr>
+        <w:t xml:space="preserve"> 關聯錯亂。</w:t>
+      </w:r>
+    </w:p>
+    <w:p>
+      <w:pPr>
+        <w:spacing w:before="120" w:after="120" w:line="336" w:lineRule="auto"/>
+        <w:rPr>
+          <w:rFonts w:ascii="標楷體" w:eastAsia="標楷體" w:hAnsi="標楷體"/>
+        </w:rPr>
+      </w:pPr>
+      <w:r>
+        <w:rPr>
+          <w:rFonts w:ascii="Segoe UI Emoji" w:eastAsia="標楷體" w:hAnsi="Segoe UI Emoji" w:cs="Segoe UI Emoji"/>
+        </w:rPr>
+        <w:t>💡</w:t>
+      </w:r>
+      <w:r>
+        <w:rPr>
+          <w:rFonts w:ascii="標楷體" w:eastAsia="標楷體" w:hAnsi="標楷體"/>
+        </w:rPr>
+        <w:t xml:space="preserve"> 解決方式：使用 TRUNCATE TABLE User; 指令，徹底清空資料並重置自動遞增計數器，讓 ID 完美從 1 重新開始。</w:t>
+      </w:r>
+    </w:p>
+    <w:p>
+      <w:pPr>
+        <w:spacing w:before="120" w:after="120" w:line="336" w:lineRule="auto"/>
+        <w:rPr>
+          <w:rFonts w:ascii="標楷體" w:eastAsia="DengXian" w:hAnsi="標楷體"/>
+        </w:rPr>
+      </w:pPr>
+      <w:r>
+        <w:rPr>
+          <w:rFonts w:ascii="Segoe UI Emoji" w:eastAsia="標楷體" w:hAnsi="Segoe UI Emoji" w:cs="Segoe UI Emoji"/>
+        </w:rPr>
+        <w:t>📌</w:t>
+      </w:r>
+      <w:r>
+        <w:rPr>
+          <w:rFonts w:ascii="標楷體" w:eastAsia="標楷體" w:hAnsi="標楷體"/>
+        </w:rPr>
+        <w:t xml:space="preserve"> 對應版本：v0.</w:t>
+      </w:r>
+      <w:r>
+        <w:rPr>
           <w:rFonts w:ascii="標楷體" w:eastAsia="DengXian" w:hAnsi="標楷體" w:hint="eastAsia"/>
-          <w:lang w:eastAsia="zh-CN"/>
+        </w:rPr>
+        <w:t>3.3</w:t>
+      </w:r>
+    </w:p>
+    <w:p>
+      <w:pPr>
+        <w:spacing w:before="120" w:after="120" w:line="336" w:lineRule="auto"/>
+        <w:rPr>
+          <w:rFonts w:ascii="標楷體" w:eastAsia="DengXian" w:hAnsi="標楷體"/>
+        </w:rPr>
+      </w:pPr>
+    </w:p>
+    <w:p>
+      <w:pPr>
+        <w:spacing w:before="120" w:after="120" w:line="336" w:lineRule="auto"/>
+        <w:rPr>
+          <w:rFonts w:ascii="標楷體" w:eastAsia="標楷體" w:hAnsi="標楷體"/>
+        </w:rPr>
+      </w:pPr>
+      <w:r>
+        <w:rPr>
+          <w:rFonts w:ascii="Segoe UI Emoji" w:eastAsia="標楷體" w:hAnsi="Segoe UI Emoji" w:cs="Segoe UI Emoji"/>
+        </w:rPr>
+        <w:t>🚨</w:t>
+      </w:r>
+      <w:r>
+        <w:rPr>
+          <w:rFonts w:ascii="標楷體" w:eastAsia="標楷體" w:hAnsi="標楷體"/>
+        </w:rPr>
+        <w:t xml:space="preserve"> 8. 預設圖片破圖問題</w:t>
+      </w:r>
+    </w:p>
+    <w:p>
+      <w:pPr>
+        <w:spacing w:before="120" w:after="120" w:line="336" w:lineRule="auto"/>
+        <w:rPr>
+          <w:rFonts w:ascii="標楷體" w:eastAsia="DengXian" w:hAnsi="標楷體"/>
         </w:rPr>
       </w:pPr>
       <w:r>
@@ -7162,222 +7318,6 @@
         <w:rPr>
           <w:rFonts w:ascii="標楷體" w:eastAsia="標楷體" w:hAnsi="標楷體"/>
         </w:rPr>
-        <w:t xml:space="preserve"> 當時狀況：註冊新帳號時報錯 Unknown column 'status' in 'field list'。</w:t>
-      </w:r>
-    </w:p>
-    <w:p>
-      <w:pPr>
-        <w:spacing w:before="120" w:after="120" w:line="336" w:lineRule="auto"/>
-        <w:rPr>
-          <w:rFonts w:ascii="標楷體" w:eastAsia="DengXian" w:hAnsi="標楷體" w:hint="eastAsia"/>
-          <w:lang w:eastAsia="zh-CN"/>
-        </w:rPr>
-      </w:pPr>
-      <w:r>
-        <w:rPr>
-          <w:rFonts w:ascii="Segoe UI Emoji" w:eastAsia="標楷體" w:hAnsi="Segoe UI Emoji" w:cs="Segoe UI Emoji"/>
-        </w:rPr>
-        <w:t>💡</w:t>
-      </w:r>
-      <w:r>
-        <w:rPr>
-          <w:rFonts w:ascii="標楷體" w:eastAsia="標楷體" w:hAnsi="標楷體"/>
-        </w:rPr>
-        <w:t xml:space="preserve"> 解決方式：為了支援管理員的「停權防護機制」，使用 SQL 指令 ALTER TABLE User ADD COLUMN status VARCHAR(20) NOT NULL DEFAULT 'active'; 擴充資料表，並同步更新</w:t>
-      </w:r>
-      <w:proofErr w:type="gramStart"/>
-      <w:r>
-        <w:rPr>
-          <w:rFonts w:ascii="標楷體" w:eastAsia="標楷體" w:hAnsi="標楷體"/>
-        </w:rPr>
-        <w:t>了建表腳本</w:t>
-      </w:r>
-      <w:proofErr w:type="gramEnd"/>
-      <w:r>
-        <w:rPr>
-          <w:rFonts w:ascii="標楷體" w:eastAsia="標楷體" w:hAnsi="標楷體"/>
-        </w:rPr>
-        <w:t>。</w:t>
-      </w:r>
-    </w:p>
-    <w:p>
-      <w:pPr>
-        <w:spacing w:before="120" w:after="120" w:line="336" w:lineRule="auto"/>
-        <w:rPr>
-          <w:rFonts w:ascii="標楷體" w:eastAsia="標楷體" w:hAnsi="標楷體"/>
-        </w:rPr>
-      </w:pPr>
-      <w:r>
-        <w:rPr>
-          <w:rFonts w:ascii="Segoe UI Emoji" w:eastAsia="標楷體" w:hAnsi="Segoe UI Emoji" w:cs="Segoe UI Emoji"/>
-        </w:rPr>
-        <w:t>📌</w:t>
-      </w:r>
-      <w:r>
-        <w:rPr>
-          <w:rFonts w:ascii="標楷體" w:eastAsia="標楷體" w:hAnsi="標楷體"/>
-        </w:rPr>
-        <w:t xml:space="preserve"> 對應版本：v0.3.3</w:t>
-      </w:r>
-    </w:p>
-    <w:p>
-      <w:pPr>
-        <w:spacing w:before="120" w:after="120" w:line="336" w:lineRule="auto"/>
-        <w:rPr>
-          <w:rFonts w:ascii="標楷體" w:eastAsia="標楷體" w:hAnsi="標楷體"/>
-        </w:rPr>
-      </w:pPr>
-    </w:p>
-    <w:p>
-      <w:pPr>
-        <w:spacing w:before="120" w:after="120" w:line="336" w:lineRule="auto"/>
-        <w:rPr>
-          <w:rFonts w:ascii="標楷體" w:eastAsia="標楷體" w:hAnsi="標楷體"/>
-        </w:rPr>
-      </w:pPr>
-      <w:r>
-        <w:rPr>
-          <w:rFonts w:ascii="Segoe UI Emoji" w:eastAsia="標楷體" w:hAnsi="Segoe UI Emoji" w:cs="Segoe UI Emoji"/>
-        </w:rPr>
-        <w:t>🚨</w:t>
-      </w:r>
-      <w:r>
-        <w:rPr>
-          <w:rFonts w:ascii="標楷體" w:eastAsia="標楷體" w:hAnsi="標楷體"/>
-        </w:rPr>
-        <w:t xml:space="preserve"> 7. AUTO_INCREMENT 計數器未歸零</w:t>
-      </w:r>
-    </w:p>
-    <w:p>
-      <w:pPr>
-        <w:spacing w:before="120" w:after="120" w:line="336" w:lineRule="auto"/>
-        <w:rPr>
-          <w:rFonts w:ascii="標楷體" w:eastAsia="DengXian" w:hAnsi="標楷體" w:hint="eastAsia"/>
-          <w:lang w:eastAsia="zh-CN"/>
-        </w:rPr>
-      </w:pPr>
-      <w:r>
-        <w:rPr>
-          <w:rFonts w:ascii="Segoe UI Emoji" w:eastAsia="標楷體" w:hAnsi="Segoe UI Emoji" w:cs="Segoe UI Emoji"/>
-        </w:rPr>
-        <w:t>🔍</w:t>
-      </w:r>
-      <w:r>
-        <w:rPr>
-          <w:rFonts w:ascii="標楷體" w:eastAsia="標楷體" w:hAnsi="標楷體"/>
-        </w:rPr>
-        <w:t xml:space="preserve"> 當時狀況：刪除測試資料後，新註冊的帳號 ID 直接跳到 5，導致與現有書籍的 </w:t>
-      </w:r>
-      <w:proofErr w:type="spellStart"/>
-      <w:r>
-        <w:rPr>
-          <w:rFonts w:ascii="標楷體" w:eastAsia="標楷體" w:hAnsi="標楷體"/>
-        </w:rPr>
-        <w:t>bdonor_id</w:t>
-      </w:r>
-      <w:proofErr w:type="spellEnd"/>
-      <w:r>
-        <w:rPr>
-          <w:rFonts w:ascii="標楷體" w:eastAsia="標楷體" w:hAnsi="標楷體"/>
-        </w:rPr>
-        <w:t xml:space="preserve"> 關聯錯亂。</w:t>
-      </w:r>
-    </w:p>
-    <w:p>
-      <w:pPr>
-        <w:spacing w:before="120" w:after="120" w:line="336" w:lineRule="auto"/>
-        <w:rPr>
-          <w:rFonts w:ascii="標楷體" w:eastAsia="標楷體" w:hAnsi="標楷體"/>
-        </w:rPr>
-      </w:pPr>
-      <w:r>
-        <w:rPr>
-          <w:rFonts w:ascii="Segoe UI Emoji" w:eastAsia="標楷體" w:hAnsi="Segoe UI Emoji" w:cs="Segoe UI Emoji"/>
-        </w:rPr>
-        <w:t>💡</w:t>
-      </w:r>
-      <w:r>
-        <w:rPr>
-          <w:rFonts w:ascii="標楷體" w:eastAsia="標楷體" w:hAnsi="標楷體"/>
-        </w:rPr>
-        <w:t xml:space="preserve"> 解決方式：使用 TRUNCATE TABLE User; 指令，徹底清空資料並重置自動遞增計數器，讓 ID 完美從 1 重新開始。</w:t>
-      </w:r>
-    </w:p>
-    <w:p>
-      <w:pPr>
-        <w:spacing w:before="120" w:after="120" w:line="336" w:lineRule="auto"/>
-        <w:rPr>
-          <w:rFonts w:ascii="標楷體" w:eastAsia="DengXian" w:hAnsi="標楷體" w:hint="eastAsia"/>
-          <w:lang w:eastAsia="zh-CN"/>
-        </w:rPr>
-      </w:pPr>
-      <w:r>
-        <w:rPr>
-          <w:rFonts w:ascii="Segoe UI Emoji" w:eastAsia="標楷體" w:hAnsi="Segoe UI Emoji" w:cs="Segoe UI Emoji"/>
-        </w:rPr>
-        <w:t>📌</w:t>
-      </w:r>
-      <w:r>
-        <w:rPr>
-          <w:rFonts w:ascii="標楷體" w:eastAsia="標楷體" w:hAnsi="標楷體"/>
-        </w:rPr>
-        <w:t xml:space="preserve"> 對應版本：v0.</w:t>
-      </w:r>
-      <w:r>
-        <w:rPr>
-          <w:rFonts w:ascii="標楷體" w:eastAsia="DengXian" w:hAnsi="標楷體" w:hint="eastAsia"/>
-          <w:lang w:eastAsia="zh-CN"/>
-        </w:rPr>
-        <w:t>3.3</w:t>
-      </w:r>
-    </w:p>
-    <w:p>
-      <w:pPr>
-        <w:spacing w:before="120" w:after="120" w:line="336" w:lineRule="auto"/>
-        <w:rPr>
-          <w:rFonts w:ascii="標楷體" w:eastAsia="DengXian" w:hAnsi="標楷體" w:hint="eastAsia"/>
-          <w:lang w:eastAsia="zh-CN"/>
-        </w:rPr>
-      </w:pPr>
-    </w:p>
-    <w:p>
-      <w:pPr>
-        <w:spacing w:before="120" w:after="120" w:line="336" w:lineRule="auto"/>
-        <w:rPr>
-          <w:rFonts w:ascii="標楷體" w:eastAsia="標楷體" w:hAnsi="標楷體"/>
-        </w:rPr>
-      </w:pPr>
-      <w:r>
-        <w:rPr>
-          <w:rFonts w:ascii="Segoe UI Emoji" w:eastAsia="標楷體" w:hAnsi="Segoe UI Emoji" w:cs="Segoe UI Emoji"/>
-        </w:rPr>
-        <w:t>🚨</w:t>
-      </w:r>
-      <w:r>
-        <w:rPr>
-          <w:rFonts w:ascii="標楷體" w:eastAsia="標楷體" w:hAnsi="標楷體"/>
-        </w:rPr>
-        <w:t xml:space="preserve"> 8. 預設圖片破圖問題</w:t>
-      </w:r>
-    </w:p>
-    <w:p>
-      <w:pPr>
-        <w:spacing w:before="120" w:after="120" w:line="336" w:lineRule="auto"/>
-        <w:rPr>
-          <w:rFonts w:ascii="標楷體" w:eastAsia="DengXian" w:hAnsi="標楷體" w:hint="eastAsia"/>
-          <w:lang w:eastAsia="zh-CN"/>
-        </w:rPr>
-      </w:pPr>
-      <w:r>
-        <w:rPr>
-          <w:rFonts w:ascii="Segoe UI Emoji" w:eastAsia="標楷體" w:hAnsi="Segoe UI Emoji" w:cs="Segoe UI Emoji"/>
-        </w:rPr>
-        <w:t>🔍</w:t>
-      </w:r>
-      <w:r>
-        <w:rPr>
-          <w:rFonts w:ascii="標楷體" w:eastAsia="標楷體" w:hAnsi="標楷體"/>
-        </w:rPr>
         <w:t xml:space="preserve"> 當時狀況：從資料庫撈出資料後，書籍封面因為缺乏實體檔案而顯示破圖。</w:t>
       </w:r>
     </w:p>
@@ -7385,7 +7325,7 @@
       <w:pPr>
         <w:spacing w:before="120" w:after="120" w:line="336" w:lineRule="auto"/>
         <w:rPr>
-          <w:rFonts w:ascii="標楷體" w:eastAsia="DengXian" w:hAnsi="標楷體" w:hint="eastAsia"/>
+          <w:rFonts w:ascii="標楷體" w:eastAsia="DengXian" w:hAnsi="標楷體"/>
           <w:lang w:eastAsia="zh-CN"/>
         </w:rPr>
       </w:pPr>
@@ -7540,21 +7480,83 @@
         <w:rPr>
           <w:rFonts w:ascii="Segoe UI Emoji" w:eastAsia="標楷體" w:hAnsi="Segoe UI Emoji" w:cs="Segoe UI Emoji"/>
         </w:rPr>
-        <w:t>當時</w:t>
+        <w:t>當時狀況：</w:t>
+      </w:r>
+      <w:r>
+        <w:rPr>
+          <w:rFonts w:ascii="Segoe UI Emoji" w:eastAsia="標楷體" w:hAnsi="Segoe UI Emoji" w:cs="Segoe UI Emoji"/>
+        </w:rPr>
+        <w:t xml:space="preserve"> </w:t>
       </w:r>
       <w:proofErr w:type="gramStart"/>
       <w:r>
         <w:rPr>
           <w:rFonts w:ascii="Segoe UI Emoji" w:eastAsia="標楷體" w:hAnsi="Segoe UI Emoji" w:cs="Segoe UI Emoji"/>
         </w:rPr>
-        <w:t>狀</w:t>
+        <w:t>實作捐書</w:t>
       </w:r>
       <w:proofErr w:type="gramEnd"/>
       <w:r>
         <w:rPr>
           <w:rFonts w:ascii="Segoe UI Emoji" w:eastAsia="標楷體" w:hAnsi="Segoe UI Emoji" w:cs="Segoe UI Emoji"/>
         </w:rPr>
-        <w:t>況：</w:t>
+        <w:t>表單時，如果只使用一般的</w:t>
+      </w:r>
+      <w:r>
+        <w:rPr>
+          <w:rFonts w:ascii="Segoe UI Emoji" w:eastAsia="標楷體" w:hAnsi="Segoe UI Emoji" w:cs="Segoe UI Emoji"/>
+        </w:rPr>
+        <w:t xml:space="preserve"> &lt;form method="POST"&gt;</w:t>
+      </w:r>
+      <w:r>
+        <w:rPr>
+          <w:rFonts w:ascii="Segoe UI Emoji" w:eastAsia="標楷體" w:hAnsi="Segoe UI Emoji" w:cs="Segoe UI Emoji"/>
+        </w:rPr>
+        <w:t>，後端</w:t>
+      </w:r>
+      <w:r>
+        <w:rPr>
+          <w:rFonts w:ascii="Segoe UI Emoji" w:eastAsia="標楷體" w:hAnsi="Segoe UI Emoji" w:cs="Segoe UI Emoji"/>
+        </w:rPr>
+        <w:t xml:space="preserve"> PHP </w:t>
+      </w:r>
+      <w:r>
+        <w:rPr>
+          <w:rFonts w:ascii="Segoe UI Emoji" w:eastAsia="標楷體" w:hAnsi="Segoe UI Emoji" w:cs="Segoe UI Emoji"/>
+        </w:rPr>
+        <w:t>的</w:t>
+      </w:r>
+      <w:r>
+        <w:rPr>
+          <w:rFonts w:ascii="Segoe UI Emoji" w:eastAsia="標楷體" w:hAnsi="Segoe UI Emoji" w:cs="Segoe UI Emoji"/>
+        </w:rPr>
+        <w:t xml:space="preserve"> $_FILES </w:t>
+      </w:r>
+      <w:r>
+        <w:rPr>
+          <w:rFonts w:ascii="Segoe UI Emoji" w:eastAsia="標楷體" w:hAnsi="Segoe UI Emoji" w:cs="Segoe UI Emoji"/>
+        </w:rPr>
+        <w:t>變數會完全收不到圖片資料，導致系統判定未上傳檔案。</w:t>
+      </w:r>
+    </w:p>
+    <w:p>
+      <w:pPr>
+        <w:spacing w:before="120" w:after="120" w:line="336" w:lineRule="auto"/>
+        <w:rPr>
+          <w:rFonts w:ascii="Segoe UI Emoji" w:eastAsia="標楷體" w:hAnsi="Segoe UI Emoji" w:cs="Segoe UI Emoji"/>
+        </w:rPr>
+      </w:pPr>
+      <w:r>
+        <w:rPr>
+          <w:rFonts w:ascii="Segoe UI Emoji" w:eastAsia="標楷體" w:hAnsi="Segoe UI Emoji" w:cs="Segoe UI Emoji"/>
+        </w:rPr>
+        <w:t xml:space="preserve">💡 </w:t>
+      </w:r>
+      <w:r>
+        <w:rPr>
+          <w:rFonts w:ascii="Segoe UI Emoji" w:eastAsia="標楷體" w:hAnsi="Segoe UI Emoji" w:cs="Segoe UI Emoji"/>
+        </w:rPr>
+        <w:t>解決方式：</w:t>
       </w:r>
       <w:r>
         <w:rPr>
@@ -7566,570 +7568,1341 @@
         <w:rPr>
           <w:rFonts w:ascii="Segoe UI Emoji" w:eastAsia="標楷體" w:hAnsi="Segoe UI Emoji" w:cs="Segoe UI Emoji"/>
         </w:rPr>
-        <w:t>實作捐</w:t>
+        <w:t>這是新手</w:t>
       </w:r>
       <w:proofErr w:type="gramStart"/>
       <w:r>
         <w:rPr>
           <w:rFonts w:ascii="Segoe UI Emoji" w:eastAsia="標楷體" w:hAnsi="Segoe UI Emoji" w:cs="Segoe UI Emoji"/>
         </w:rPr>
-        <w:t>書</w:t>
+        <w:t>最常踩的</w:t>
       </w:r>
       <w:proofErr w:type="gramEnd"/>
       <w:r>
         <w:rPr>
           <w:rFonts w:ascii="Segoe UI Emoji" w:eastAsia="標楷體" w:hAnsi="Segoe UI Emoji" w:cs="Segoe UI Emoji"/>
         </w:rPr>
-        <w:t>表</w:t>
+        <w:t>坑。必須強制在</w:t>
+      </w:r>
+      <w:r>
+        <w:rPr>
+          <w:rFonts w:ascii="Segoe UI Emoji" w:eastAsia="標楷體" w:hAnsi="Segoe UI Emoji" w:cs="Segoe UI Emoji"/>
+        </w:rPr>
+        <w:t xml:space="preserve"> HTML </w:t>
+      </w:r>
+      <w:r>
+        <w:rPr>
+          <w:rFonts w:ascii="Segoe UI Emoji" w:eastAsia="標楷體" w:hAnsi="Segoe UI Emoji" w:cs="Segoe UI Emoji"/>
+        </w:rPr>
+        <w:t>表單加入</w:t>
+      </w:r>
+      <w:r>
+        <w:rPr>
+          <w:rFonts w:ascii="Segoe UI Emoji" w:eastAsia="標楷體" w:hAnsi="Segoe UI Emoji" w:cs="Segoe UI Emoji"/>
+        </w:rPr>
+        <w:t xml:space="preserve"> </w:t>
+      </w:r>
+      <w:proofErr w:type="spellStart"/>
+      <w:r>
+        <w:rPr>
+          <w:rFonts w:ascii="Segoe UI Emoji" w:eastAsia="標楷體" w:hAnsi="Segoe UI Emoji" w:cs="Segoe UI Emoji"/>
+        </w:rPr>
+        <w:t>enctype</w:t>
+      </w:r>
+      <w:proofErr w:type="spellEnd"/>
+      <w:r>
+        <w:rPr>
+          <w:rFonts w:ascii="Segoe UI Emoji" w:eastAsia="標楷體" w:hAnsi="Segoe UI Emoji" w:cs="Segoe UI Emoji"/>
+        </w:rPr>
+        <w:t xml:space="preserve">="multipart/form-data" </w:t>
+      </w:r>
+      <w:r>
+        <w:rPr>
+          <w:rFonts w:ascii="Segoe UI Emoji" w:eastAsia="標楷體" w:hAnsi="Segoe UI Emoji" w:cs="Segoe UI Emoji"/>
+        </w:rPr>
+        <w:t>屬性，讓瀏覽器知道這份表單包含「二進位實體檔案」，才能順利打通前後端的圖片傳輸通道。</w:t>
+      </w:r>
+    </w:p>
+    <w:p>
+      <w:pPr>
+        <w:spacing w:before="120" w:after="120" w:line="336" w:lineRule="auto"/>
+        <w:rPr>
+          <w:rFonts w:ascii="Segoe UI Emoji" w:eastAsia="標楷體" w:hAnsi="Segoe UI Emoji" w:cs="Segoe UI Emoji"/>
+        </w:rPr>
+      </w:pPr>
+      <w:r>
+        <w:rPr>
+          <w:rFonts w:ascii="Segoe UI Emoji" w:eastAsia="標楷體" w:hAnsi="Segoe UI Emoji" w:cs="Segoe UI Emoji"/>
+        </w:rPr>
+        <w:t xml:space="preserve">📌 </w:t>
+      </w:r>
+      <w:r>
+        <w:rPr>
+          <w:rFonts w:ascii="Segoe UI Emoji" w:eastAsia="標楷體" w:hAnsi="Segoe UI Emoji" w:cs="Segoe UI Emoji"/>
+        </w:rPr>
+        <w:t>對應版本：</w:t>
+      </w:r>
+      <w:r>
+        <w:rPr>
+          <w:rFonts w:ascii="Segoe UI Emoji" w:eastAsia="標楷體" w:hAnsi="Segoe UI Emoji" w:cs="Segoe UI Emoji"/>
+        </w:rPr>
+        <w:t xml:space="preserve"> v0.3.5</w:t>
+      </w:r>
+    </w:p>
+    <w:p>
+      <w:pPr>
+        <w:spacing w:before="120" w:after="120" w:line="336" w:lineRule="auto"/>
+        <w:rPr>
+          <w:rFonts w:ascii="Segoe UI Emoji" w:eastAsia="標楷體" w:hAnsi="Segoe UI Emoji" w:cs="Segoe UI Emoji"/>
+        </w:rPr>
+      </w:pPr>
+    </w:p>
+    <w:p>
+      <w:pPr>
+        <w:spacing w:before="120" w:after="120" w:line="336" w:lineRule="auto"/>
+        <w:rPr>
+          <w:rFonts w:ascii="Segoe UI Emoji" w:eastAsia="標楷體" w:hAnsi="Segoe UI Emoji" w:cs="Segoe UI Emoji"/>
+        </w:rPr>
+      </w:pPr>
+      <w:r>
+        <w:rPr>
+          <w:rFonts w:ascii="Segoe UI Emoji" w:eastAsia="標楷體" w:hAnsi="Segoe UI Emoji" w:cs="Segoe UI Emoji"/>
+        </w:rPr>
+        <w:t xml:space="preserve">🚨 10. </w:t>
+      </w:r>
+      <w:r>
+        <w:rPr>
+          <w:rFonts w:ascii="Segoe UI Emoji" w:eastAsia="標楷體" w:hAnsi="Segoe UI Emoji" w:cs="Segoe UI Emoji"/>
+        </w:rPr>
+        <w:t>上傳同名圖片導致伺服器檔案覆蓋</w:t>
+      </w:r>
+    </w:p>
+    <w:p>
+      <w:pPr>
+        <w:spacing w:before="120" w:after="120" w:line="336" w:lineRule="auto"/>
+        <w:rPr>
+          <w:rFonts w:ascii="Segoe UI Emoji" w:eastAsia="標楷體" w:hAnsi="Segoe UI Emoji" w:cs="Segoe UI Emoji"/>
+        </w:rPr>
+      </w:pPr>
+      <w:r>
+        <w:rPr>
+          <w:rFonts w:ascii="Segoe UI Emoji" w:eastAsia="標楷體" w:hAnsi="Segoe UI Emoji" w:cs="Segoe UI Emoji"/>
+        </w:rPr>
+        <w:t xml:space="preserve">🔍 </w:t>
+      </w:r>
+      <w:r>
+        <w:rPr>
+          <w:rFonts w:ascii="Segoe UI Emoji" w:eastAsia="標楷體" w:hAnsi="Segoe UI Emoji" w:cs="Segoe UI Emoji"/>
+        </w:rPr>
+        <w:t>當時狀況：</w:t>
+      </w:r>
+      <w:r>
+        <w:rPr>
+          <w:rFonts w:ascii="Segoe UI Emoji" w:eastAsia="標楷體" w:hAnsi="Segoe UI Emoji" w:cs="Segoe UI Emoji"/>
+        </w:rPr>
+        <w:t xml:space="preserve"> </w:t>
+      </w:r>
+      <w:r>
+        <w:rPr>
+          <w:rFonts w:ascii="Segoe UI Emoji" w:eastAsia="標楷體" w:hAnsi="Segoe UI Emoji" w:cs="Segoe UI Emoji"/>
+        </w:rPr>
+        <w:t>不同的使用者在客戶端上傳圖片時，可能都將檔案命名為</w:t>
+      </w:r>
+      <w:r>
+        <w:rPr>
+          <w:rFonts w:ascii="Segoe UI Emoji" w:eastAsia="標楷體" w:hAnsi="Segoe UI Emoji" w:cs="Segoe UI Emoji"/>
+        </w:rPr>
+        <w:t xml:space="preserve"> cover.jpg </w:t>
+      </w:r>
+      <w:r>
+        <w:rPr>
+          <w:rFonts w:ascii="Segoe UI Emoji" w:eastAsia="標楷體" w:hAnsi="Segoe UI Emoji" w:cs="Segoe UI Emoji"/>
+        </w:rPr>
+        <w:t>或</w:t>
+      </w:r>
+      <w:r>
+        <w:rPr>
+          <w:rFonts w:ascii="Segoe UI Emoji" w:eastAsia="標楷體" w:hAnsi="Segoe UI Emoji" w:cs="Segoe UI Emoji"/>
+        </w:rPr>
+        <w:t xml:space="preserve"> test.jpg</w:t>
+      </w:r>
+      <w:r>
+        <w:rPr>
+          <w:rFonts w:ascii="Segoe UI Emoji" w:eastAsia="標楷體" w:hAnsi="Segoe UI Emoji" w:cs="Segoe UI Emoji"/>
+        </w:rPr>
+        <w:t>。若直接將客戶端檔名存入伺服器，後上傳的圖片會直接把前面使用者的圖片覆蓋掉，導致破圖或圖文不符。</w:t>
+      </w:r>
+    </w:p>
+    <w:p>
+      <w:pPr>
+        <w:spacing w:before="120" w:after="120" w:line="336" w:lineRule="auto"/>
+        <w:rPr>
+          <w:rFonts w:ascii="Segoe UI Emoji" w:eastAsia="標楷體" w:hAnsi="Segoe UI Emoji" w:cs="Segoe UI Emoji"/>
+        </w:rPr>
+      </w:pPr>
+      <w:r>
+        <w:rPr>
+          <w:rFonts w:ascii="Segoe UI Emoji" w:eastAsia="標楷體" w:hAnsi="Segoe UI Emoji" w:cs="Segoe UI Emoji"/>
+        </w:rPr>
+        <w:t xml:space="preserve">💡 </w:t>
+      </w:r>
+      <w:r>
+        <w:rPr>
+          <w:rFonts w:ascii="Segoe UI Emoji" w:eastAsia="標楷體" w:hAnsi="Segoe UI Emoji" w:cs="Segoe UI Emoji"/>
+        </w:rPr>
+        <w:t>解決方式：</w:t>
+      </w:r>
+      <w:r>
+        <w:rPr>
+          <w:rFonts w:ascii="Segoe UI Emoji" w:eastAsia="標楷體" w:hAnsi="Segoe UI Emoji" w:cs="Segoe UI Emoji"/>
+        </w:rPr>
+        <w:t xml:space="preserve"> </w:t>
+      </w:r>
+      <w:r>
+        <w:rPr>
+          <w:rFonts w:ascii="Segoe UI Emoji" w:eastAsia="標楷體" w:hAnsi="Segoe UI Emoji" w:cs="Segoe UI Emoji"/>
+        </w:rPr>
+        <w:t>在後端</w:t>
+      </w:r>
+      <w:r>
+        <w:rPr>
+          <w:rFonts w:ascii="Segoe UI Emoji" w:eastAsia="標楷體" w:hAnsi="Segoe UI Emoji" w:cs="Segoe UI Emoji"/>
+        </w:rPr>
+        <w:t xml:space="preserve"> API (</w:t>
+      </w:r>
+      <w:proofErr w:type="spellStart"/>
+      <w:r>
+        <w:rPr>
+          <w:rFonts w:ascii="Segoe UI Emoji" w:eastAsia="標楷體" w:hAnsi="Segoe UI Emoji" w:cs="Segoe UI Emoji"/>
+        </w:rPr>
+        <w:t>upload_book.php</w:t>
+      </w:r>
+      <w:proofErr w:type="spellEnd"/>
+      <w:r>
+        <w:rPr>
+          <w:rFonts w:ascii="Segoe UI Emoji" w:eastAsia="標楷體" w:hAnsi="Segoe UI Emoji" w:cs="Segoe UI Emoji"/>
+        </w:rPr>
+        <w:t xml:space="preserve">) </w:t>
+      </w:r>
+      <w:r>
+        <w:rPr>
+          <w:rFonts w:ascii="Segoe UI Emoji" w:eastAsia="標楷體" w:hAnsi="Segoe UI Emoji" w:cs="Segoe UI Emoji"/>
+        </w:rPr>
+        <w:t>接收檔案時，徹底捨棄原始檔名。改用</w:t>
+      </w:r>
+      <w:r>
+        <w:rPr>
+          <w:rFonts w:ascii="Segoe UI Emoji" w:eastAsia="標楷體" w:hAnsi="Segoe UI Emoji" w:cs="Segoe UI Emoji"/>
+        </w:rPr>
+        <w:t xml:space="preserve"> PHP </w:t>
+      </w:r>
+      <w:r>
+        <w:rPr>
+          <w:rFonts w:ascii="Segoe UI Emoji" w:eastAsia="標楷體" w:hAnsi="Segoe UI Emoji" w:cs="Segoe UI Emoji"/>
+        </w:rPr>
+        <w:t>的</w:t>
+      </w:r>
+      <w:r>
+        <w:rPr>
+          <w:rFonts w:ascii="Segoe UI Emoji" w:eastAsia="標楷體" w:hAnsi="Segoe UI Emoji" w:cs="Segoe UI Emoji"/>
+        </w:rPr>
+        <w:t xml:space="preserve"> </w:t>
+      </w:r>
+      <w:proofErr w:type="spellStart"/>
+      <w:r>
+        <w:rPr>
+          <w:rFonts w:ascii="Segoe UI Emoji" w:eastAsia="標楷體" w:hAnsi="Segoe UI Emoji" w:cs="Segoe UI Emoji"/>
+        </w:rPr>
+        <w:t>uniqid</w:t>
+      </w:r>
+      <w:proofErr w:type="spellEnd"/>
+      <w:r>
+        <w:rPr>
+          <w:rFonts w:ascii="Segoe UI Emoji" w:eastAsia="標楷體" w:hAnsi="Segoe UI Emoji" w:cs="Segoe UI Emoji"/>
+        </w:rPr>
+        <w:t xml:space="preserve">('book_') </w:t>
+      </w:r>
+      <w:r>
+        <w:rPr>
+          <w:rFonts w:ascii="Segoe UI Emoji" w:eastAsia="標楷體" w:hAnsi="Segoe UI Emoji" w:cs="Segoe UI Emoji"/>
+        </w:rPr>
+        <w:t>函數搭配原始副檔名，為每張圖片在伺服器端動態生成唯一且不重複的新檔名</w:t>
       </w:r>
       <w:proofErr w:type="gramStart"/>
       <w:r>
         <w:rPr>
           <w:rFonts w:ascii="Segoe UI Emoji" w:eastAsia="標楷體" w:hAnsi="Segoe UI Emoji" w:cs="Segoe UI Emoji"/>
         </w:rPr>
-        <w:t>單</w:t>
+        <w:t>（</w:t>
       </w:r>
       <w:proofErr w:type="gramEnd"/>
       <w:r>
         <w:rPr>
           <w:rFonts w:ascii="Segoe UI Emoji" w:eastAsia="標楷體" w:hAnsi="Segoe UI Emoji" w:cs="Segoe UI Emoji"/>
         </w:rPr>
-        <w:t>時，如果只使用一般的</w:t>
-      </w:r>
-      <w:r>
-        <w:rPr>
-          <w:rFonts w:ascii="Segoe UI Emoji" w:eastAsia="標楷體" w:hAnsi="Segoe UI Emoji" w:cs="Segoe UI Emoji"/>
-        </w:rPr>
-        <w:t xml:space="preserve"> &lt;form method="POST"&gt;</w:t>
-      </w:r>
-      <w:r>
-        <w:rPr>
-          <w:rFonts w:ascii="Segoe UI Emoji" w:eastAsia="標楷體" w:hAnsi="Segoe UI Emoji" w:cs="Segoe UI Emoji"/>
-        </w:rPr>
-        <w:t>，</w:t>
+        <w:t>如</w:t>
+      </w:r>
+      <w:r>
+        <w:rPr>
+          <w:rFonts w:ascii="Segoe UI Emoji" w:eastAsia="標楷體" w:hAnsi="Segoe UI Emoji" w:cs="Segoe UI Emoji"/>
+        </w:rPr>
+        <w:t xml:space="preserve"> book_64a1b.jpg</w:t>
       </w:r>
       <w:proofErr w:type="gramStart"/>
       <w:r>
         <w:rPr>
           <w:rFonts w:ascii="Segoe UI Emoji" w:eastAsia="標楷體" w:hAnsi="Segoe UI Emoji" w:cs="Segoe UI Emoji"/>
         </w:rPr>
-        <w:t>後</w:t>
+        <w:t>）</w:t>
       </w:r>
       <w:proofErr w:type="gramEnd"/>
       <w:r>
         <w:rPr>
           <w:rFonts w:ascii="Segoe UI Emoji" w:eastAsia="標楷體" w:hAnsi="Segoe UI Emoji" w:cs="Segoe UI Emoji"/>
         </w:rPr>
-        <w:t>端</w:t>
-      </w:r>
-      <w:r>
-        <w:rPr>
-          <w:rFonts w:ascii="Segoe UI Emoji" w:eastAsia="標楷體" w:hAnsi="Segoe UI Emoji" w:cs="Segoe UI Emoji"/>
+        <w:t>，從根本解決命名衝突。</w:t>
+      </w:r>
+    </w:p>
+    <w:p>
+      <w:pPr>
+        <w:spacing w:before="120" w:after="120" w:line="336" w:lineRule="auto"/>
+        <w:rPr>
+          <w:rFonts w:ascii="Segoe UI Emoji" w:eastAsia="DengXian" w:hAnsi="Segoe UI Emoji" w:cs="Segoe UI Emoji"/>
+        </w:rPr>
+      </w:pPr>
+      <w:r>
+        <w:rPr>
+          <w:rFonts w:ascii="Segoe UI Emoji" w:eastAsia="標楷體" w:hAnsi="Segoe UI Emoji" w:cs="Segoe UI Emoji"/>
+        </w:rPr>
+        <w:t xml:space="preserve">📌 </w:t>
+      </w:r>
+      <w:r>
+        <w:rPr>
+          <w:rFonts w:ascii="Segoe UI Emoji" w:eastAsia="標楷體" w:hAnsi="Segoe UI Emoji" w:cs="Segoe UI Emoji"/>
+        </w:rPr>
+        <w:t>對應版本：</w:t>
+      </w:r>
+      <w:r>
+        <w:rPr>
+          <w:rFonts w:ascii="Segoe UI Emoji" w:eastAsia="標楷體" w:hAnsi="Segoe UI Emoji" w:cs="Segoe UI Emoji"/>
+        </w:rPr>
+        <w:t xml:space="preserve"> v0.3.5</w:t>
+      </w:r>
+    </w:p>
+    <w:p>
+      <w:pPr>
+        <w:spacing w:before="120" w:after="120" w:line="336" w:lineRule="auto"/>
+        <w:rPr>
+          <w:rFonts w:ascii="Segoe UI Emoji" w:hAnsi="Segoe UI Emoji" w:cs="Segoe UI Emoji"/>
+        </w:rPr>
+      </w:pPr>
+    </w:p>
+    <w:p>
+      <w:pPr>
+        <w:spacing w:before="120" w:after="120" w:line="336" w:lineRule="auto"/>
+        <w:rPr>
+          <w:rFonts w:ascii="Segoe UI Emoji" w:hAnsi="Segoe UI Emoji" w:cs="Segoe UI Emoji"/>
+        </w:rPr>
+      </w:pPr>
+      <w:r>
+        <w:rPr>
+          <w:rFonts w:ascii="Segoe UI Emoji" w:hAnsi="Segoe UI Emoji" w:cs="Segoe UI Emoji"/>
+        </w:rPr>
+        <w:t xml:space="preserve">🚨 11. Git </w:t>
+      </w:r>
+      <w:r>
+        <w:rPr>
+          <w:rFonts w:ascii="Segoe UI Emoji" w:hAnsi="Segoe UI Emoji" w:cs="Segoe UI Emoji"/>
+        </w:rPr>
+        <w:t>版本</w:t>
+      </w:r>
+      <w:proofErr w:type="gramStart"/>
+      <w:r>
+        <w:rPr>
+          <w:rFonts w:ascii="Segoe UI Emoji" w:hAnsi="Segoe UI Emoji" w:cs="Segoe UI Emoji"/>
+        </w:rPr>
+        <w:t>號跳號且</w:t>
+      </w:r>
+      <w:proofErr w:type="gramEnd"/>
+      <w:r>
+        <w:rPr>
+          <w:rFonts w:ascii="Segoe UI Emoji" w:hAnsi="Segoe UI Emoji" w:cs="Segoe UI Emoji"/>
+        </w:rPr>
+        <w:t>已</w:t>
+      </w:r>
+      <w:r>
+        <w:rPr>
+          <w:rFonts w:ascii="Segoe UI Emoji" w:hAnsi="Segoe UI Emoji" w:cs="Segoe UI Emoji"/>
+        </w:rPr>
+        <w:t xml:space="preserve"> Push </w:t>
+      </w:r>
+      <w:r>
+        <w:rPr>
+          <w:rFonts w:ascii="Segoe UI Emoji" w:hAnsi="Segoe UI Emoji" w:cs="Segoe UI Emoji"/>
+        </w:rPr>
+        <w:t>至遠端倉庫</w:t>
+      </w:r>
+    </w:p>
+    <w:p>
+      <w:pPr>
+        <w:spacing w:before="120" w:after="120" w:line="336" w:lineRule="auto"/>
+        <w:rPr>
+          <w:rFonts w:ascii="Segoe UI Emoji" w:hAnsi="Segoe UI Emoji" w:cs="Segoe UI Emoji"/>
+        </w:rPr>
+      </w:pPr>
+      <w:r>
+        <w:rPr>
+          <w:rFonts w:ascii="Segoe UI Emoji" w:hAnsi="Segoe UI Emoji" w:cs="Segoe UI Emoji"/>
+        </w:rPr>
+        <w:t xml:space="preserve">🔍 </w:t>
+      </w:r>
+      <w:r>
+        <w:rPr>
+          <w:rFonts w:ascii="Segoe UI Emoji" w:hAnsi="Segoe UI Emoji" w:cs="Segoe UI Emoji"/>
+        </w:rPr>
+        <w:t>當時狀況：</w:t>
+      </w:r>
+      <w:r>
+        <w:rPr>
+          <w:rFonts w:ascii="Segoe UI Emoji" w:hAnsi="Segoe UI Emoji" w:cs="Segoe UI Emoji"/>
+        </w:rPr>
+        <w:t xml:space="preserve"> </w:t>
+      </w:r>
+      <w:r>
+        <w:rPr>
+          <w:rFonts w:ascii="Segoe UI Emoji" w:hAnsi="Segoe UI Emoji" w:cs="Segoe UI Emoji"/>
+        </w:rPr>
+        <w:t>在推行個人後</w:t>
+      </w:r>
+      <w:proofErr w:type="gramStart"/>
+      <w:r>
+        <w:rPr>
+          <w:rFonts w:ascii="Segoe UI Emoji" w:hAnsi="Segoe UI Emoji" w:cs="Segoe UI Emoji"/>
+        </w:rPr>
+        <w:t>臺</w:t>
+      </w:r>
+      <w:proofErr w:type="gramEnd"/>
+      <w:r>
+        <w:rPr>
+          <w:rFonts w:ascii="Segoe UI Emoji" w:hAnsi="Segoe UI Emoji" w:cs="Segoe UI Emoji"/>
+        </w:rPr>
+        <w:t xml:space="preserve"> CRUD </w:t>
+      </w:r>
+      <w:r>
+        <w:rPr>
+          <w:rFonts w:ascii="Segoe UI Emoji" w:hAnsi="Segoe UI Emoji" w:cs="Segoe UI Emoji"/>
+        </w:rPr>
+        <w:t>功能時，版本號計算錯誤直接從</w:t>
+      </w:r>
+      <w:r>
+        <w:rPr>
+          <w:rFonts w:ascii="Segoe UI Emoji" w:hAnsi="Segoe UI Emoji" w:cs="Segoe UI Emoji"/>
+        </w:rPr>
+        <w:t xml:space="preserve"> v0.3.7 </w:t>
+      </w:r>
+      <w:r>
+        <w:rPr>
+          <w:rFonts w:ascii="Segoe UI Emoji" w:hAnsi="Segoe UI Emoji" w:cs="Segoe UI Emoji"/>
+        </w:rPr>
+        <w:t>跳到了</w:t>
+      </w:r>
+      <w:r>
+        <w:rPr>
+          <w:rFonts w:ascii="Segoe UI Emoji" w:hAnsi="Segoe UI Emoji" w:cs="Segoe UI Emoji"/>
+        </w:rPr>
+        <w:t xml:space="preserve"> v0.3.9</w:t>
+      </w:r>
+      <w:r>
+        <w:rPr>
+          <w:rFonts w:ascii="Segoe UI Emoji" w:hAnsi="Segoe UI Emoji" w:cs="Segoe UI Emoji"/>
+        </w:rPr>
+        <w:t>，且程式碼</w:t>
+      </w:r>
+      <w:proofErr w:type="gramStart"/>
+      <w:r>
+        <w:rPr>
+          <w:rFonts w:ascii="Segoe UI Emoji" w:hAnsi="Segoe UI Emoji" w:cs="Segoe UI Emoji"/>
+        </w:rPr>
+        <w:t>已經執了</w:t>
+      </w:r>
+      <w:proofErr w:type="gramEnd"/>
+      <w:r>
+        <w:rPr>
+          <w:rFonts w:ascii="Segoe UI Emoji" w:hAnsi="Segoe UI Emoji" w:cs="Segoe UI Emoji"/>
+        </w:rPr>
+        <w:t xml:space="preserve"> git push</w:t>
+      </w:r>
+      <w:r>
+        <w:rPr>
+          <w:rFonts w:ascii="Segoe UI Emoji" w:hAnsi="Segoe UI Emoji" w:cs="Segoe UI Emoji"/>
+        </w:rPr>
+        <w:t>，需要將最後一次提交</w:t>
+      </w:r>
+      <w:proofErr w:type="gramStart"/>
+      <w:r>
+        <w:rPr>
+          <w:rFonts w:ascii="Segoe UI Emoji" w:hAnsi="Segoe UI Emoji" w:cs="Segoe UI Emoji"/>
+        </w:rPr>
+        <w:t>的版號修正</w:t>
+      </w:r>
+      <w:proofErr w:type="gramEnd"/>
+      <w:r>
+        <w:rPr>
+          <w:rFonts w:ascii="Segoe UI Emoji" w:hAnsi="Segoe UI Emoji" w:cs="Segoe UI Emoji"/>
+        </w:rPr>
+        <w:t>並合併為</w:t>
+      </w:r>
+      <w:r>
+        <w:rPr>
+          <w:rFonts w:ascii="Segoe UI Emoji" w:hAnsi="Segoe UI Emoji" w:cs="Segoe UI Emoji"/>
+        </w:rPr>
+        <w:t xml:space="preserve"> v0.3.8</w:t>
+      </w:r>
+      <w:r>
+        <w:rPr>
+          <w:rFonts w:ascii="Segoe UI Emoji" w:hAnsi="Segoe UI Emoji" w:cs="Segoe UI Emoji"/>
+        </w:rPr>
+        <w:t>。</w:t>
+      </w:r>
+    </w:p>
+    <w:p>
+      <w:pPr>
+        <w:spacing w:before="120" w:after="120" w:line="336" w:lineRule="auto"/>
+        <w:rPr>
+          <w:rFonts w:ascii="Segoe UI Emoji" w:hAnsi="Segoe UI Emoji" w:cs="Segoe UI Emoji"/>
+        </w:rPr>
+      </w:pPr>
+      <w:r>
+        <w:rPr>
+          <w:rFonts w:ascii="Segoe UI Emoji" w:hAnsi="Segoe UI Emoji" w:cs="Segoe UI Emoji"/>
+        </w:rPr>
+        <w:t xml:space="preserve">💡 </w:t>
+      </w:r>
+      <w:r>
+        <w:rPr>
+          <w:rFonts w:ascii="Segoe UI Emoji" w:hAnsi="Segoe UI Emoji" w:cs="Segoe UI Emoji"/>
+        </w:rPr>
+        <w:t>解決方式：</w:t>
+      </w:r>
+      <w:r>
+        <w:rPr>
+          <w:rFonts w:ascii="Segoe UI Emoji" w:hAnsi="Segoe UI Emoji" w:cs="Segoe UI Emoji"/>
+        </w:rPr>
+        <w:t xml:space="preserve"> </w:t>
+      </w:r>
+      <w:r>
+        <w:rPr>
+          <w:rFonts w:ascii="Segoe UI Emoji" w:hAnsi="Segoe UI Emoji" w:cs="Segoe UI Emoji"/>
+        </w:rPr>
+        <w:t>利用</w:t>
+      </w:r>
+      <w:r>
+        <w:rPr>
+          <w:rFonts w:ascii="Segoe UI Emoji" w:hAnsi="Segoe UI Emoji" w:cs="Segoe UI Emoji"/>
+        </w:rPr>
+        <w:t xml:space="preserve"> git commit --amend -m "</w:t>
+      </w:r>
+      <w:r>
+        <w:rPr>
+          <w:rFonts w:ascii="Segoe UI Emoji" w:hAnsi="Segoe UI Emoji" w:cs="Segoe UI Emoji"/>
+        </w:rPr>
+        <w:t>新訊息</w:t>
+      </w:r>
+      <w:r>
+        <w:rPr>
+          <w:rFonts w:ascii="Segoe UI Emoji" w:hAnsi="Segoe UI Emoji" w:cs="Segoe UI Emoji"/>
+        </w:rPr>
+        <w:t xml:space="preserve">" </w:t>
+      </w:r>
+      <w:r>
+        <w:rPr>
+          <w:rFonts w:ascii="Segoe UI Emoji" w:hAnsi="Segoe UI Emoji" w:cs="Segoe UI Emoji"/>
+        </w:rPr>
+        <w:t>指令重寫本機最後一次的提交紀錄（不影響程式碼內容），接著使用</w:t>
+      </w:r>
+      <w:r>
+        <w:rPr>
+          <w:rFonts w:ascii="Segoe UI Emoji" w:hAnsi="Segoe UI Emoji" w:cs="Segoe UI Emoji"/>
+        </w:rPr>
+        <w:t xml:space="preserve"> git push origin main --force </w:t>
+      </w:r>
+      <w:r>
+        <w:rPr>
+          <w:rFonts w:ascii="Segoe UI Emoji" w:hAnsi="Segoe UI Emoji" w:cs="Segoe UI Emoji"/>
+        </w:rPr>
+        <w:t>強制覆蓋遠端倉庫，完美修正歷史軸。</w:t>
+      </w:r>
+    </w:p>
+    <w:p>
+      <w:pPr>
+        <w:spacing w:before="120" w:after="120" w:line="336" w:lineRule="auto"/>
+        <w:rPr>
+          <w:rFonts w:ascii="Segoe UI Emoji" w:hAnsi="Segoe UI Emoji" w:cs="Segoe UI Emoji"/>
+        </w:rPr>
+      </w:pPr>
+      <w:r>
+        <w:rPr>
+          <w:rFonts w:ascii="Segoe UI Emoji" w:hAnsi="Segoe UI Emoji" w:cs="Segoe UI Emoji"/>
+        </w:rPr>
+        <w:lastRenderedPageBreak/>
+        <w:t xml:space="preserve">📌 </w:t>
+      </w:r>
+      <w:r>
+        <w:rPr>
+          <w:rFonts w:ascii="Segoe UI Emoji" w:hAnsi="Segoe UI Emoji" w:cs="Segoe UI Emoji"/>
+        </w:rPr>
+        <w:t>對應版本：</w:t>
+      </w:r>
+      <w:r>
+        <w:rPr>
+          <w:rFonts w:ascii="Segoe UI Emoji" w:hAnsi="Segoe UI Emoji" w:cs="Segoe UI Emoji"/>
+        </w:rPr>
+        <w:t xml:space="preserve"> v0.3.8</w:t>
+      </w:r>
+    </w:p>
+    <w:p>
+      <w:pPr>
+        <w:spacing w:before="120" w:after="120" w:line="336" w:lineRule="auto"/>
+        <w:rPr>
+          <w:rFonts w:ascii="Segoe UI Emoji" w:hAnsi="Segoe UI Emoji" w:cs="Segoe UI Emoji"/>
+        </w:rPr>
+      </w:pPr>
+    </w:p>
+    <w:p>
+      <w:pPr>
+        <w:spacing w:before="120" w:after="120" w:line="336" w:lineRule="auto"/>
+        <w:rPr>
+          <w:rFonts w:ascii="Segoe UI Emoji" w:hAnsi="Segoe UI Emoji" w:cs="Segoe UI Emoji"/>
+        </w:rPr>
+      </w:pPr>
+      <w:r>
+        <w:rPr>
+          <w:rFonts w:ascii="Segoe UI Emoji" w:hAnsi="Segoe UI Emoji" w:cs="Segoe UI Emoji"/>
+        </w:rPr>
+        <w:t xml:space="preserve">🚨 12. AJAX </w:t>
+      </w:r>
+      <w:r>
+        <w:rPr>
+          <w:rFonts w:ascii="Segoe UI Emoji" w:hAnsi="Segoe UI Emoji" w:cs="Segoe UI Emoji"/>
+        </w:rPr>
+        <w:t>同步請求造成的重複寫入</w:t>
+      </w:r>
+      <w:r>
+        <w:rPr>
+          <w:rFonts w:ascii="Segoe UI Emoji" w:hAnsi="Segoe UI Emoji" w:cs="Segoe UI Emoji"/>
+        </w:rPr>
+        <w:t xml:space="preserve"> (</w:t>
+      </w:r>
+      <w:proofErr w:type="gramStart"/>
+      <w:r>
+        <w:rPr>
+          <w:rFonts w:ascii="Segoe UI Emoji" w:hAnsi="Segoe UI Emoji" w:cs="Segoe UI Emoji"/>
+        </w:rPr>
+        <w:t>競態條件</w:t>
+      </w:r>
+      <w:proofErr w:type="gramEnd"/>
+      <w:r>
+        <w:rPr>
+          <w:rFonts w:ascii="Segoe UI Emoji" w:hAnsi="Segoe UI Emoji" w:cs="Segoe UI Emoji"/>
+        </w:rPr>
+        <w:t>)</w:t>
+      </w:r>
+    </w:p>
+    <w:p>
+      <w:pPr>
+        <w:spacing w:before="120" w:after="120" w:line="336" w:lineRule="auto"/>
+        <w:rPr>
+          <w:rFonts w:ascii="Segoe UI Emoji" w:hAnsi="Segoe UI Emoji" w:cs="Segoe UI Emoji"/>
+        </w:rPr>
+      </w:pPr>
+      <w:r>
+        <w:rPr>
+          <w:rFonts w:ascii="Segoe UI Emoji" w:hAnsi="Segoe UI Emoji" w:cs="Segoe UI Emoji"/>
+        </w:rPr>
+        <w:t xml:space="preserve">🔍 </w:t>
+      </w:r>
+      <w:r>
+        <w:rPr>
+          <w:rFonts w:ascii="Segoe UI Emoji" w:hAnsi="Segoe UI Emoji" w:cs="Segoe UI Emoji"/>
+        </w:rPr>
+        <w:t>當時狀況：</w:t>
+      </w:r>
+      <w:r>
+        <w:rPr>
+          <w:rFonts w:ascii="Segoe UI Emoji" w:hAnsi="Segoe UI Emoji" w:cs="Segoe UI Emoji"/>
+        </w:rPr>
+        <w:t xml:space="preserve"> </w:t>
+      </w:r>
+      <w:r>
+        <w:rPr>
+          <w:rFonts w:ascii="Segoe UI Emoji" w:hAnsi="Segoe UI Emoji" w:cs="Segoe UI Emoji"/>
+        </w:rPr>
+        <w:t>因為前端</w:t>
+      </w:r>
+      <w:r>
+        <w:rPr>
+          <w:rFonts w:ascii="Segoe UI Emoji" w:hAnsi="Segoe UI Emoji" w:cs="Segoe UI Emoji"/>
+        </w:rPr>
+        <w:t xml:space="preserve"> JavaScript </w:t>
+      </w:r>
+      <w:r>
+        <w:rPr>
+          <w:rFonts w:ascii="Segoe UI Emoji" w:hAnsi="Segoe UI Emoji" w:cs="Segoe UI Emoji"/>
+        </w:rPr>
+        <w:t>重複綁定事件，導致點擊一下會觸發兩次</w:t>
+      </w:r>
+      <w:r>
+        <w:rPr>
+          <w:rFonts w:ascii="Segoe UI Emoji" w:hAnsi="Segoe UI Emoji" w:cs="Segoe UI Emoji"/>
+        </w:rPr>
+        <w:t xml:space="preserve"> API </w:t>
+      </w:r>
+      <w:r>
+        <w:rPr>
+          <w:rFonts w:ascii="Segoe UI Emoji" w:hAnsi="Segoe UI Emoji" w:cs="Segoe UI Emoji"/>
+        </w:rPr>
+        <w:t>請求，造成資料庫互動數</w:t>
+      </w:r>
+      <w:r>
+        <w:rPr>
+          <w:rFonts w:ascii="Segoe UI Emoji" w:hAnsi="Segoe UI Emoji" w:cs="Segoe UI Emoji"/>
+        </w:rPr>
+        <w:t xml:space="preserve"> +2</w:t>
+      </w:r>
+      <w:r>
+        <w:rPr>
+          <w:rFonts w:ascii="Segoe UI Emoji" w:hAnsi="Segoe UI Emoji" w:cs="Segoe UI Emoji"/>
+        </w:rPr>
+        <w:t>。</w:t>
+      </w:r>
+    </w:p>
+    <w:p>
+      <w:pPr>
+        <w:spacing w:before="120" w:after="120" w:line="336" w:lineRule="auto"/>
+        <w:rPr>
+          <w:rFonts w:ascii="Segoe UI Emoji" w:hAnsi="Segoe UI Emoji" w:cs="Segoe UI Emoji"/>
+        </w:rPr>
+      </w:pPr>
+      <w:r>
+        <w:rPr>
+          <w:rFonts w:ascii="Segoe UI Emoji" w:hAnsi="Segoe UI Emoji" w:cs="Segoe UI Emoji"/>
+        </w:rPr>
+        <w:t xml:space="preserve">💡 </w:t>
+      </w:r>
+      <w:r>
+        <w:rPr>
+          <w:rFonts w:ascii="Segoe UI Emoji" w:hAnsi="Segoe UI Emoji" w:cs="Segoe UI Emoji"/>
+        </w:rPr>
+        <w:t>解決方式：</w:t>
+      </w:r>
+      <w:r>
+        <w:rPr>
+          <w:rFonts w:ascii="Segoe UI Emoji" w:hAnsi="Segoe UI Emoji" w:cs="Segoe UI Emoji"/>
+        </w:rPr>
+        <w:t xml:space="preserve"> 1. </w:t>
+      </w:r>
+      <w:r>
+        <w:rPr>
+          <w:rFonts w:ascii="Segoe UI Emoji" w:hAnsi="Segoe UI Emoji" w:cs="Segoe UI Emoji"/>
+        </w:rPr>
+        <w:t>移除重複載入：清理</w:t>
+      </w:r>
+      <w:r>
+        <w:rPr>
+          <w:rFonts w:ascii="Segoe UI Emoji" w:hAnsi="Segoe UI Emoji" w:cs="Segoe UI Emoji"/>
+        </w:rPr>
+        <w:t xml:space="preserve"> </w:t>
+      </w:r>
+      <w:proofErr w:type="spellStart"/>
+      <w:r>
+        <w:rPr>
+          <w:rFonts w:ascii="Segoe UI Emoji" w:hAnsi="Segoe UI Emoji" w:cs="Segoe UI Emoji"/>
+        </w:rPr>
+        <w:t>book_detail.php</w:t>
+      </w:r>
+      <w:proofErr w:type="spellEnd"/>
+      <w:r>
+        <w:rPr>
+          <w:rFonts w:ascii="Segoe UI Emoji" w:hAnsi="Segoe UI Emoji" w:cs="Segoe UI Emoji"/>
+        </w:rPr>
+        <w:t xml:space="preserve"> </w:t>
+      </w:r>
+      <w:r>
+        <w:rPr>
+          <w:rFonts w:ascii="Segoe UI Emoji" w:hAnsi="Segoe UI Emoji" w:cs="Segoe UI Emoji"/>
+        </w:rPr>
+        <w:t>中多餘的</w:t>
+      </w:r>
+      <w:r>
+        <w:rPr>
+          <w:rFonts w:ascii="Segoe UI Emoji" w:hAnsi="Segoe UI Emoji" w:cs="Segoe UI Emoji"/>
+        </w:rPr>
+        <w:t xml:space="preserve"> &lt;script&gt; </w:t>
+      </w:r>
+      <w:r>
+        <w:rPr>
+          <w:rFonts w:ascii="Segoe UI Emoji" w:hAnsi="Segoe UI Emoji" w:cs="Segoe UI Emoji"/>
+        </w:rPr>
+        <w:t>引用，確保</w:t>
+      </w:r>
+      <w:r>
+        <w:rPr>
+          <w:rFonts w:ascii="Segoe UI Emoji" w:hAnsi="Segoe UI Emoji" w:cs="Segoe UI Emoji"/>
+        </w:rPr>
+        <w:t xml:space="preserve"> JS </w:t>
+      </w:r>
+      <w:r>
+        <w:rPr>
+          <w:rFonts w:ascii="Segoe UI Emoji" w:hAnsi="Segoe UI Emoji" w:cs="Segoe UI Emoji"/>
+        </w:rPr>
+        <w:t>只被初始化一次。</w:t>
+      </w:r>
+    </w:p>
+    <w:p>
+      <w:pPr>
+        <w:spacing w:before="120" w:after="120" w:line="336" w:lineRule="auto"/>
+        <w:rPr>
+          <w:rFonts w:ascii="Segoe UI Emoji" w:hAnsi="Segoe UI Emoji" w:cs="Segoe UI Emoji"/>
+        </w:rPr>
+      </w:pPr>
+      <w:r>
+        <w:rPr>
+          <w:rFonts w:ascii="Segoe UI Emoji" w:hAnsi="Segoe UI Emoji" w:cs="Segoe UI Emoji"/>
+        </w:rPr>
+        <w:t xml:space="preserve">2. </w:t>
+      </w:r>
+      <w:r>
+        <w:rPr>
+          <w:rFonts w:ascii="Segoe UI Emoji" w:hAnsi="Segoe UI Emoji" w:cs="Segoe UI Emoji"/>
+        </w:rPr>
+        <w:t>清理舊邏輯：刪除</w:t>
+      </w:r>
+      <w:r>
+        <w:rPr>
+          <w:rFonts w:ascii="Segoe UI Emoji" w:hAnsi="Segoe UI Emoji" w:cs="Segoe UI Emoji"/>
+        </w:rPr>
+        <w:t xml:space="preserve"> script.js </w:t>
+      </w:r>
+      <w:r>
+        <w:rPr>
+          <w:rFonts w:ascii="Segoe UI Emoji" w:hAnsi="Segoe UI Emoji" w:cs="Segoe UI Emoji"/>
+        </w:rPr>
+        <w:t>中殘留的</w:t>
+      </w:r>
+      <w:r>
+        <w:rPr>
+          <w:rFonts w:ascii="Segoe UI Emoji" w:hAnsi="Segoe UI Emoji" w:cs="Segoe UI Emoji"/>
+        </w:rPr>
+        <w:t xml:space="preserve"> jQuery </w:t>
+      </w:r>
+      <w:r>
+        <w:rPr>
+          <w:rFonts w:ascii="Segoe UI Emoji" w:hAnsi="Segoe UI Emoji" w:cs="Segoe UI Emoji"/>
+        </w:rPr>
+        <w:t>假互動代碼。</w:t>
+      </w:r>
+    </w:p>
+    <w:p>
+      <w:pPr>
+        <w:spacing w:before="120" w:after="120" w:line="336" w:lineRule="auto"/>
+        <w:rPr>
+          <w:rFonts w:ascii="Segoe UI Emoji" w:hAnsi="Segoe UI Emoji" w:cs="Segoe UI Emoji"/>
+        </w:rPr>
+      </w:pPr>
+      <w:r>
+        <w:rPr>
+          <w:rFonts w:ascii="Segoe UI Emoji" w:hAnsi="Segoe UI Emoji" w:cs="Segoe UI Emoji"/>
+        </w:rPr>
+        <w:t xml:space="preserve">3. </w:t>
+      </w:r>
+      <w:r>
+        <w:rPr>
+          <w:rFonts w:ascii="Segoe UI Emoji" w:hAnsi="Segoe UI Emoji" w:cs="Segoe UI Emoji"/>
+        </w:rPr>
+        <w:t>資料庫層級防禦：對</w:t>
+      </w:r>
+      <w:r>
+        <w:rPr>
+          <w:rFonts w:ascii="Segoe UI Emoji" w:hAnsi="Segoe UI Emoji" w:cs="Segoe UI Emoji"/>
+        </w:rPr>
+        <w:t xml:space="preserve"> Interaction </w:t>
+      </w:r>
+      <w:r>
+        <w:rPr>
+          <w:rFonts w:ascii="Segoe UI Emoji" w:hAnsi="Segoe UI Emoji" w:cs="Segoe UI Emoji"/>
+        </w:rPr>
+        <w:t>資料表新增</w:t>
+      </w:r>
+      <w:r>
+        <w:rPr>
+          <w:rFonts w:ascii="Segoe UI Emoji" w:hAnsi="Segoe UI Emoji" w:cs="Segoe UI Emoji"/>
+        </w:rPr>
+        <w:t xml:space="preserve"> UNIQUE KEY (</w:t>
+      </w:r>
+      <w:proofErr w:type="spellStart"/>
+      <w:r>
+        <w:rPr>
+          <w:rFonts w:ascii="Segoe UI Emoji" w:hAnsi="Segoe UI Emoji" w:cs="Segoe UI Emoji"/>
+        </w:rPr>
+        <w:t>ibook_id</w:t>
+      </w:r>
+      <w:proofErr w:type="spellEnd"/>
+      <w:r>
+        <w:rPr>
+          <w:rFonts w:ascii="Segoe UI Emoji" w:hAnsi="Segoe UI Emoji" w:cs="Segoe UI Emoji"/>
+        </w:rPr>
+        <w:t xml:space="preserve">, </w:t>
+      </w:r>
+      <w:proofErr w:type="spellStart"/>
+      <w:r>
+        <w:rPr>
+          <w:rFonts w:ascii="Segoe UI Emoji" w:hAnsi="Segoe UI Emoji" w:cs="Segoe UI Emoji"/>
+        </w:rPr>
+        <w:t>iuser_id</w:t>
+      </w:r>
+      <w:proofErr w:type="spellEnd"/>
+      <w:r>
+        <w:rPr>
+          <w:rFonts w:ascii="Segoe UI Emoji" w:hAnsi="Segoe UI Emoji" w:cs="Segoe UI Emoji"/>
+        </w:rPr>
+        <w:t xml:space="preserve">, </w:t>
+      </w:r>
+      <w:proofErr w:type="spellStart"/>
+      <w:r>
+        <w:rPr>
+          <w:rFonts w:ascii="Segoe UI Emoji" w:hAnsi="Segoe UI Emoji" w:cs="Segoe UI Emoji"/>
+        </w:rPr>
+        <w:t>iinteraction_type</w:t>
+      </w:r>
+      <w:proofErr w:type="spellEnd"/>
+      <w:r>
+        <w:rPr>
+          <w:rFonts w:ascii="Segoe UI Emoji" w:hAnsi="Segoe UI Emoji" w:cs="Segoe UI Emoji"/>
+        </w:rPr>
+        <w:t>)</w:t>
+      </w:r>
+      <w:r>
+        <w:rPr>
+          <w:rFonts w:ascii="Segoe UI Emoji" w:hAnsi="Segoe UI Emoji" w:cs="Segoe UI Emoji"/>
+        </w:rPr>
+        <w:t>，強制從資料庫結構面確保互動紀錄的唯一性，即使前端發送了多次請求，資料庫也不會重複累加。</w:t>
+      </w:r>
+    </w:p>
+    <w:p>
+      <w:pPr>
+        <w:spacing w:before="120" w:after="120" w:line="336" w:lineRule="auto"/>
+        <w:rPr>
+          <w:rFonts w:ascii="Segoe UI Emoji" w:hAnsi="Segoe UI Emoji" w:cs="Segoe UI Emoji" w:hint="eastAsia"/>
+        </w:rPr>
+      </w:pPr>
+      <w:r>
+        <w:rPr>
+          <w:rFonts w:ascii="Segoe UI Emoji" w:hAnsi="Segoe UI Emoji" w:cs="Segoe UI Emoji"/>
+        </w:rPr>
+        <w:t xml:space="preserve">📌 </w:t>
+      </w:r>
+      <w:r>
+        <w:rPr>
+          <w:rFonts w:ascii="Segoe UI Emoji" w:hAnsi="Segoe UI Emoji" w:cs="Segoe UI Emoji"/>
+        </w:rPr>
+        <w:t>對應版本：</w:t>
+      </w:r>
+      <w:r>
+        <w:rPr>
+          <w:rFonts w:ascii="Segoe UI Emoji" w:hAnsi="Segoe UI Emoji" w:cs="Segoe UI Emoji"/>
+        </w:rPr>
+        <w:t xml:space="preserve"> v0.4.0</w:t>
+      </w:r>
+    </w:p>
+    <w:p>
+      <w:pPr>
+        <w:spacing w:before="120" w:after="120" w:line="336" w:lineRule="auto"/>
+        <w:rPr>
+          <w:rFonts w:ascii="標楷體" w:eastAsia="DengXian" w:hAnsi="標楷體" w:cs="Segoe UI Emoji"/>
+          <w:lang w:eastAsia="zh-CN"/>
+        </w:rPr>
+      </w:pPr>
+    </w:p>
+    <w:p>
+      <w:pPr>
+        <w:spacing w:before="120" w:after="120" w:line="336" w:lineRule="auto"/>
+        <w:rPr>
+          <w:rFonts w:ascii="標楷體" w:eastAsia="DengXian" w:hAnsi="標楷體" w:cs="Segoe UI Emoji"/>
+        </w:rPr>
+      </w:pPr>
+      <w:r>
+        <w:rPr>
+          <w:rFonts w:ascii="Segoe UI Emoji" w:eastAsia="DengXian" w:hAnsi="Segoe UI Emoji" w:cs="Segoe UI Emoji"/>
+        </w:rPr>
+        <w:t>🚨</w:t>
+      </w:r>
+      <w:r>
+        <w:rPr>
+          <w:rFonts w:ascii="標楷體" w:eastAsia="DengXian" w:hAnsi="標楷體" w:cs="Segoe UI Emoji"/>
+        </w:rPr>
+        <w:t xml:space="preserve"> 13. </w:t>
+      </w:r>
+      <w:r>
+        <w:rPr>
+          <w:rFonts w:ascii="標楷體" w:eastAsia="DengXian" w:hAnsi="標楷體" w:cs="Segoe UI Emoji"/>
+        </w:rPr>
+        <w:t>前端靜態腳本遭瀏覽器快取</w:t>
+      </w:r>
+      <w:r>
+        <w:rPr>
+          <w:rFonts w:ascii="標楷體" w:eastAsia="DengXian" w:hAnsi="標楷體" w:cs="Segoe UI Emoji"/>
+        </w:rPr>
+        <w:t xml:space="preserve"> (Cache) </w:t>
+      </w:r>
+      <w:r>
+        <w:rPr>
+          <w:rFonts w:ascii="標楷體" w:eastAsia="DengXian" w:hAnsi="標楷體" w:cs="Segoe UI Emoji"/>
+        </w:rPr>
+        <w:t>導致新功能失效</w:t>
+      </w:r>
+    </w:p>
+    <w:p>
+      <w:pPr>
+        <w:spacing w:before="120" w:after="120" w:line="336" w:lineRule="auto"/>
+        <w:rPr>
+          <w:rFonts w:ascii="標楷體" w:eastAsia="DengXian" w:hAnsi="標楷體" w:cs="Segoe UI Emoji"/>
+        </w:rPr>
+      </w:pPr>
+      <w:r>
+        <w:rPr>
+          <w:rFonts w:ascii="Segoe UI Emoji" w:eastAsia="DengXian" w:hAnsi="Segoe UI Emoji" w:cs="Segoe UI Emoji"/>
+        </w:rPr>
+        <w:t>🔍</w:t>
+      </w:r>
+      <w:r>
+        <w:rPr>
+          <w:rFonts w:ascii="標楷體" w:eastAsia="DengXian" w:hAnsi="標楷體" w:cs="Segoe UI Emoji"/>
+        </w:rPr>
+        <w:t xml:space="preserve"> </w:t>
+      </w:r>
+      <w:r>
+        <w:rPr>
+          <w:rFonts w:ascii="標楷體" w:eastAsia="DengXian" w:hAnsi="標楷體" w:cs="Segoe UI Emoji"/>
+        </w:rPr>
+        <w:t>當時狀況：</w:t>
+      </w:r>
+      <w:r>
+        <w:rPr>
+          <w:rFonts w:ascii="標楷體" w:eastAsia="DengXian" w:hAnsi="標楷體" w:cs="Segoe UI Emoji"/>
+        </w:rPr>
+        <w:t xml:space="preserve"> </w:t>
+      </w:r>
+      <w:r>
+        <w:rPr>
+          <w:rFonts w:ascii="標楷體" w:eastAsia="DengXian" w:hAnsi="標楷體" w:cs="Segoe UI Emoji"/>
+        </w:rPr>
+        <w:t>實作留言板</w:t>
+      </w:r>
+      <w:r>
+        <w:rPr>
+          <w:rFonts w:ascii="標楷體" w:eastAsia="DengXian" w:hAnsi="標楷體" w:cs="Segoe UI Emoji"/>
+        </w:rPr>
+        <w:t xml:space="preserve"> AJAX </w:t>
+      </w:r>
+      <w:r>
+        <w:rPr>
+          <w:rFonts w:ascii="標楷體" w:eastAsia="DengXian" w:hAnsi="標楷體" w:cs="Segoe UI Emoji"/>
+        </w:rPr>
+        <w:t>功能時，點擊發布會出現成功的動畫，但資料庫完全沒有新增紀錄，且一按</w:t>
+      </w:r>
+      <w:r>
+        <w:rPr>
+          <w:rFonts w:ascii="標楷體" w:eastAsia="DengXian" w:hAnsi="標楷體" w:cs="Segoe UI Emoji"/>
+        </w:rPr>
+        <w:t xml:space="preserve"> F5 </w:t>
+      </w:r>
+      <w:r>
+        <w:rPr>
+          <w:rFonts w:ascii="標楷體" w:eastAsia="DengXian" w:hAnsi="標楷體" w:cs="Segoe UI Emoji"/>
+        </w:rPr>
+        <w:t>重新整理，留言就會直接消失（出現幽靈留言現象）。</w:t>
+      </w:r>
+    </w:p>
+    <w:p>
+      <w:pPr>
+        <w:spacing w:before="120" w:after="120" w:line="336" w:lineRule="auto"/>
+        <w:rPr>
+          <w:rFonts w:ascii="標楷體" w:eastAsia="DengXian" w:hAnsi="標楷體" w:cs="Segoe UI Emoji"/>
+        </w:rPr>
+      </w:pPr>
+      <w:r>
+        <w:rPr>
+          <w:rFonts w:ascii="Segoe UI Emoji" w:eastAsia="DengXian" w:hAnsi="Segoe UI Emoji" w:cs="Segoe UI Emoji"/>
+        </w:rPr>
+        <w:t>💡</w:t>
+      </w:r>
+      <w:r>
+        <w:rPr>
+          <w:rFonts w:ascii="標楷體" w:eastAsia="DengXian" w:hAnsi="標楷體" w:cs="Segoe UI Emoji"/>
+        </w:rPr>
+        <w:t xml:space="preserve"> </w:t>
+      </w:r>
+      <w:r>
+        <w:rPr>
+          <w:rFonts w:ascii="標楷體" w:eastAsia="DengXian" w:hAnsi="標楷體" w:cs="Segoe UI Emoji"/>
+        </w:rPr>
+        <w:t>解決方式：</w:t>
+      </w:r>
+      <w:r>
+        <w:rPr>
+          <w:rFonts w:ascii="標楷體" w:eastAsia="DengXian" w:hAnsi="標楷體" w:cs="Segoe UI Emoji"/>
+        </w:rPr>
+        <w:t xml:space="preserve"> </w:t>
+      </w:r>
+      <w:r>
+        <w:rPr>
+          <w:rFonts w:ascii="標楷體" w:eastAsia="DengXian" w:hAnsi="標楷體" w:cs="Segoe UI Emoji"/>
+        </w:rPr>
+        <w:t>追查確認並非資料庫限制或</w:t>
+      </w:r>
+      <w:r>
+        <w:rPr>
+          <w:rFonts w:ascii="標楷體" w:eastAsia="DengXian" w:hAnsi="標楷體" w:cs="Segoe UI Emoji"/>
         </w:rPr>
         <w:t xml:space="preserve"> PHP </w:t>
       </w:r>
       <w:r>
         <w:rPr>
-          <w:rFonts w:ascii="Segoe UI Emoji" w:eastAsia="標楷體" w:hAnsi="Segoe UI Emoji" w:cs="Segoe UI Emoji"/>
-        </w:rPr>
-        <w:t>的</w:t>
-      </w:r>
-      <w:r>
-        <w:rPr>
-          <w:rFonts w:ascii="Segoe UI Emoji" w:eastAsia="標楷體" w:hAnsi="Segoe UI Emoji" w:cs="Segoe UI Emoji"/>
-        </w:rPr>
-        <w:t xml:space="preserve"> $_FILES </w:t>
-      </w:r>
-      <w:r>
-        <w:rPr>
-          <w:rFonts w:ascii="Segoe UI Emoji" w:eastAsia="標楷體" w:hAnsi="Segoe UI Emoji" w:cs="Segoe UI Emoji"/>
-        </w:rPr>
-        <w:t>變</w:t>
+          <w:rFonts w:ascii="標楷體" w:eastAsia="DengXian" w:hAnsi="標楷體" w:cs="Segoe UI Emoji"/>
+        </w:rPr>
+        <w:t>語法錯誤，而是瀏覽器為了節省流量，並未重新下載修改後的檔案，而是偷偷執行了舊版含有「純視覺假動作邏輯」的</w:t>
+      </w:r>
+      <w:r>
+        <w:rPr>
+          <w:rFonts w:ascii="標楷體" w:eastAsia="DengXian" w:hAnsi="標楷體" w:cs="Segoe UI Emoji"/>
+        </w:rPr>
+        <w:t xml:space="preserve"> script.js</w:t>
+      </w:r>
+      <w:r>
+        <w:rPr>
+          <w:rFonts w:ascii="標楷體" w:eastAsia="DengXian" w:hAnsi="標楷體" w:cs="Segoe UI Emoji"/>
+        </w:rPr>
+        <w:t>。解決方法為在</w:t>
+      </w:r>
+      <w:r>
+        <w:rPr>
+          <w:rFonts w:ascii="標楷體" w:eastAsia="DengXian" w:hAnsi="標楷體" w:cs="Segoe UI Emoji"/>
+        </w:rPr>
+        <w:t xml:space="preserve"> </w:t>
+      </w:r>
+      <w:proofErr w:type="spellStart"/>
+      <w:r>
+        <w:rPr>
+          <w:rFonts w:ascii="標楷體" w:eastAsia="DengXian" w:hAnsi="標楷體" w:cs="Segoe UI Emoji"/>
+        </w:rPr>
+        <w:t>footer.php</w:t>
+      </w:r>
+      <w:proofErr w:type="spellEnd"/>
+      <w:r>
+        <w:rPr>
+          <w:rFonts w:ascii="標楷體" w:eastAsia="DengXian" w:hAnsi="標楷體" w:cs="Segoe UI Emoji"/>
+        </w:rPr>
+        <w:t xml:space="preserve"> </w:t>
+      </w:r>
+      <w:r>
+        <w:rPr>
+          <w:rFonts w:ascii="標楷體" w:eastAsia="DengXian" w:hAnsi="標楷體" w:cs="Segoe UI Emoji"/>
+        </w:rPr>
+        <w:t>引入</w:t>
+      </w:r>
+      <w:r>
+        <w:rPr>
+          <w:rFonts w:ascii="標楷體" w:eastAsia="DengXian" w:hAnsi="標楷體" w:cs="Segoe UI Emoji"/>
+        </w:rPr>
+        <w:t xml:space="preserve"> JS </w:t>
+      </w:r>
+      <w:r>
+        <w:rPr>
+          <w:rFonts w:ascii="標楷體" w:eastAsia="DengXian" w:hAnsi="標楷體" w:cs="Segoe UI Emoji"/>
+        </w:rPr>
+        <w:t>的路徑後方，加入</w:t>
+      </w:r>
+      <w:r>
+        <w:rPr>
+          <w:rFonts w:ascii="標楷體" w:eastAsia="DengXian" w:hAnsi="標楷體" w:cs="Segoe UI Emoji"/>
+        </w:rPr>
+        <w:t xml:space="preserve"> PHP </w:t>
+      </w:r>
+      <w:r>
+        <w:rPr>
+          <w:rFonts w:ascii="標楷體" w:eastAsia="DengXian" w:hAnsi="標楷體" w:cs="Segoe UI Emoji"/>
+        </w:rPr>
+        <w:t>動態時間戳記參數</w:t>
       </w:r>
       <w:proofErr w:type="gramStart"/>
       <w:r>
         <w:rPr>
-          <w:rFonts w:ascii="Segoe UI Emoji" w:eastAsia="標楷體" w:hAnsi="Segoe UI Emoji" w:cs="Segoe UI Emoji"/>
-        </w:rPr>
-        <w:t>數會</w:t>
+          <w:rFonts w:ascii="標楷體" w:eastAsia="DengXian" w:hAnsi="標楷體" w:cs="Segoe UI Emoji"/>
+        </w:rPr>
+        <w:t>（</w:t>
       </w:r>
       <w:proofErr w:type="gramEnd"/>
       <w:r>
         <w:rPr>
-          <w:rFonts w:ascii="Segoe UI Emoji" w:eastAsia="標楷體" w:hAnsi="Segoe UI Emoji" w:cs="Segoe UI Emoji"/>
-        </w:rPr>
-        <w:t>完全收不到圖片資料，</w:t>
+          <w:rFonts w:ascii="標楷體" w:eastAsia="DengXian" w:hAnsi="標楷體" w:cs="Segoe UI Emoji"/>
+        </w:rPr>
+        <w:t>如</w:t>
+      </w:r>
+      <w:r>
+        <w:rPr>
+          <w:rFonts w:ascii="標楷體" w:eastAsia="DengXian" w:hAnsi="標楷體" w:cs="Segoe UI Emoji"/>
+        </w:rPr>
+        <w:t xml:space="preserve"> &lt;script </w:t>
+      </w:r>
+      <w:proofErr w:type="spellStart"/>
+      <w:r>
+        <w:rPr>
+          <w:rFonts w:ascii="標楷體" w:eastAsia="DengXian" w:hAnsi="標楷體" w:cs="Segoe UI Emoji"/>
+        </w:rPr>
+        <w:t>src</w:t>
+      </w:r>
+      <w:proofErr w:type="spellEnd"/>
+      <w:r>
+        <w:rPr>
+          <w:rFonts w:ascii="標楷體" w:eastAsia="DengXian" w:hAnsi="標楷體" w:cs="Segoe UI Emoji"/>
+        </w:rPr>
+        <w:t>="assets/</w:t>
+      </w:r>
+      <w:proofErr w:type="spellStart"/>
+      <w:r>
+        <w:rPr>
+          <w:rFonts w:ascii="標楷體" w:eastAsia="DengXian" w:hAnsi="標楷體" w:cs="Segoe UI Emoji"/>
+        </w:rPr>
+        <w:t>script.js?v</w:t>
+      </w:r>
+      <w:proofErr w:type="spellEnd"/>
+      <w:r>
+        <w:rPr>
+          <w:rFonts w:ascii="標楷體" w:eastAsia="DengXian" w:hAnsi="標楷體" w:cs="Segoe UI Emoji"/>
+        </w:rPr>
+        <w:t>=&lt;?</w:t>
+      </w:r>
+      <w:proofErr w:type="spellStart"/>
+      <w:r>
+        <w:rPr>
+          <w:rFonts w:ascii="標楷體" w:eastAsia="DengXian" w:hAnsi="標楷體" w:cs="Segoe UI Emoji"/>
+        </w:rPr>
+        <w:t>php</w:t>
+      </w:r>
+      <w:proofErr w:type="spellEnd"/>
+      <w:r>
+        <w:rPr>
+          <w:rFonts w:ascii="標楷體" w:eastAsia="DengXian" w:hAnsi="標楷體" w:cs="Segoe UI Emoji"/>
+        </w:rPr>
+        <w:t xml:space="preserve"> echo </w:t>
       </w:r>
       <w:proofErr w:type="gramStart"/>
       <w:r>
         <w:rPr>
-          <w:rFonts w:ascii="Segoe UI Emoji" w:eastAsia="標楷體" w:hAnsi="Segoe UI Emoji" w:cs="Segoe UI Emoji"/>
-        </w:rPr>
-        <w:t>導</w:t>
+          <w:rFonts w:ascii="標楷體" w:eastAsia="DengXian" w:hAnsi="標楷體" w:cs="Segoe UI Emoji"/>
+        </w:rPr>
+        <w:t>time(</w:t>
       </w:r>
       <w:proofErr w:type="gramEnd"/>
       <w:r>
         <w:rPr>
-          <w:rFonts w:ascii="Segoe UI Emoji" w:eastAsia="標楷體" w:hAnsi="Segoe UI Emoji" w:cs="Segoe UI Emoji"/>
-        </w:rPr>
-        <w:t>致系統判定未上</w:t>
+          <w:rFonts w:ascii="標楷體" w:eastAsia="DengXian" w:hAnsi="標楷體" w:cs="Segoe UI Emoji"/>
+        </w:rPr>
+        <w:t>)</w:t>
       </w:r>
       <w:proofErr w:type="gramStart"/>
       <w:r>
         <w:rPr>
-          <w:rFonts w:ascii="Segoe UI Emoji" w:eastAsia="標楷體" w:hAnsi="Segoe UI Emoji" w:cs="Segoe UI Emoji"/>
-        </w:rPr>
-        <w:t>傳</w:t>
+          <w:rFonts w:ascii="標楷體" w:eastAsia="DengXian" w:hAnsi="標楷體" w:cs="Segoe UI Emoji"/>
+        </w:rPr>
+        <w:t>; ?</w:t>
       </w:r>
       <w:proofErr w:type="gramEnd"/>
       <w:r>
         <w:rPr>
-          <w:rFonts w:ascii="Segoe UI Emoji" w:eastAsia="標楷體" w:hAnsi="Segoe UI Emoji" w:cs="Segoe UI Emoji"/>
-        </w:rPr>
-        <w:t>檔案。</w:t>
-      </w:r>
-    </w:p>
-    <w:p>
-      <w:pPr>
-        <w:spacing w:before="120" w:after="120" w:line="336" w:lineRule="auto"/>
-        <w:rPr>
-          <w:rFonts w:ascii="Segoe UI Emoji" w:eastAsia="標楷體" w:hAnsi="Segoe UI Emoji" w:cs="Segoe UI Emoji"/>
-        </w:rPr>
-      </w:pPr>
-      <w:r>
-        <w:rPr>
-          <w:rFonts w:ascii="Segoe UI Emoji" w:eastAsia="標楷體" w:hAnsi="Segoe UI Emoji" w:cs="Segoe UI Emoji"/>
-        </w:rPr>
-        <w:t xml:space="preserve">💡 </w:t>
-      </w:r>
-      <w:r>
-        <w:rPr>
-          <w:rFonts w:ascii="Segoe UI Emoji" w:eastAsia="標楷體" w:hAnsi="Segoe UI Emoji" w:cs="Segoe UI Emoji"/>
-        </w:rPr>
-        <w:t>解決方式：</w:t>
-      </w:r>
-      <w:r>
-        <w:rPr>
-          <w:rFonts w:ascii="Segoe UI Emoji" w:eastAsia="標楷體" w:hAnsi="Segoe UI Emoji" w:cs="Segoe UI Emoji"/>
-        </w:rPr>
-        <w:t xml:space="preserve"> </w:t>
-      </w:r>
-      <w:r>
-        <w:rPr>
-          <w:rFonts w:ascii="Segoe UI Emoji" w:eastAsia="標楷體" w:hAnsi="Segoe UI Emoji" w:cs="Segoe UI Emoji"/>
-        </w:rPr>
-        <w:t>這是新手</w:t>
-      </w:r>
-      <w:proofErr w:type="gramStart"/>
-      <w:r>
-        <w:rPr>
-          <w:rFonts w:ascii="Segoe UI Emoji" w:eastAsia="標楷體" w:hAnsi="Segoe UI Emoji" w:cs="Segoe UI Emoji"/>
-        </w:rPr>
-        <w:t>最常踩的</w:t>
-      </w:r>
-      <w:proofErr w:type="gramEnd"/>
-      <w:r>
-        <w:rPr>
-          <w:rFonts w:ascii="Segoe UI Emoji" w:eastAsia="標楷體" w:hAnsi="Segoe UI Emoji" w:cs="Segoe UI Emoji"/>
-        </w:rPr>
-        <w:t>坑。必須強制在</w:t>
-      </w:r>
-      <w:r>
-        <w:rPr>
-          <w:rFonts w:ascii="Segoe UI Emoji" w:eastAsia="標楷體" w:hAnsi="Segoe UI Emoji" w:cs="Segoe UI Emoji"/>
-        </w:rPr>
-        <w:t xml:space="preserve"> HTML </w:t>
-      </w:r>
-      <w:r>
-        <w:rPr>
-          <w:rFonts w:ascii="Segoe UI Emoji" w:eastAsia="標楷體" w:hAnsi="Segoe UI Emoji" w:cs="Segoe UI Emoji"/>
-        </w:rPr>
-        <w:t>表單加入</w:t>
-      </w:r>
-      <w:r>
-        <w:rPr>
-          <w:rFonts w:ascii="Segoe UI Emoji" w:eastAsia="標楷體" w:hAnsi="Segoe UI Emoji" w:cs="Segoe UI Emoji"/>
-        </w:rPr>
-        <w:t xml:space="preserve"> </w:t>
-      </w:r>
-      <w:proofErr w:type="spellStart"/>
-      <w:r>
-        <w:rPr>
-          <w:rFonts w:ascii="Segoe UI Emoji" w:eastAsia="標楷體" w:hAnsi="Segoe UI Emoji" w:cs="Segoe UI Emoji"/>
-        </w:rPr>
-        <w:t>enctype</w:t>
-      </w:r>
-      <w:proofErr w:type="spellEnd"/>
-      <w:r>
-        <w:rPr>
-          <w:rFonts w:ascii="Segoe UI Emoji" w:eastAsia="標楷體" w:hAnsi="Segoe UI Emoji" w:cs="Segoe UI Emoji"/>
-        </w:rPr>
-        <w:t xml:space="preserve">="multipart/form-data" </w:t>
-      </w:r>
-      <w:r>
-        <w:rPr>
-          <w:rFonts w:ascii="Segoe UI Emoji" w:eastAsia="標楷體" w:hAnsi="Segoe UI Emoji" w:cs="Segoe UI Emoji"/>
-        </w:rPr>
-        <w:t>屬性，讓瀏覽器知道這份表單包含「二進位實體檔案」，才能順利打通前後端的圖片傳輸通道。</w:t>
-      </w:r>
-    </w:p>
-    <w:p>
-      <w:pPr>
-        <w:spacing w:before="120" w:after="120" w:line="336" w:lineRule="auto"/>
-        <w:rPr>
-          <w:rFonts w:ascii="Segoe UI Emoji" w:eastAsia="標楷體" w:hAnsi="Segoe UI Emoji" w:cs="Segoe UI Emoji"/>
-        </w:rPr>
-      </w:pPr>
-      <w:r>
-        <w:rPr>
-          <w:rFonts w:ascii="Segoe UI Emoji" w:eastAsia="標楷體" w:hAnsi="Segoe UI Emoji" w:cs="Segoe UI Emoji"/>
-        </w:rPr>
-        <w:t xml:space="preserve">📌 </w:t>
-      </w:r>
-      <w:r>
-        <w:rPr>
-          <w:rFonts w:ascii="Segoe UI Emoji" w:eastAsia="標楷體" w:hAnsi="Segoe UI Emoji" w:cs="Segoe UI Emoji"/>
-        </w:rPr>
-        <w:t>對應版本：</w:t>
-      </w:r>
-      <w:r>
-        <w:rPr>
-          <w:rFonts w:ascii="Segoe UI Emoji" w:eastAsia="標楷體" w:hAnsi="Segoe UI Emoji" w:cs="Segoe UI Emoji"/>
-        </w:rPr>
-        <w:t xml:space="preserve"> v0.3.5</w:t>
-      </w:r>
-    </w:p>
-    <w:p>
-      <w:pPr>
-        <w:spacing w:before="120" w:after="120" w:line="336" w:lineRule="auto"/>
-        <w:rPr>
-          <w:rFonts w:ascii="Segoe UI Emoji" w:eastAsia="標楷體" w:hAnsi="Segoe UI Emoji" w:cs="Segoe UI Emoji"/>
-        </w:rPr>
-      </w:pPr>
-    </w:p>
-    <w:p>
-      <w:pPr>
-        <w:spacing w:before="120" w:after="120" w:line="336" w:lineRule="auto"/>
-        <w:rPr>
-          <w:rFonts w:ascii="Segoe UI Emoji" w:eastAsia="標楷體" w:hAnsi="Segoe UI Emoji" w:cs="Segoe UI Emoji"/>
-        </w:rPr>
-      </w:pPr>
-      <w:r>
-        <w:rPr>
-          <w:rFonts w:ascii="Segoe UI Emoji" w:eastAsia="標楷體" w:hAnsi="Segoe UI Emoji" w:cs="Segoe UI Emoji"/>
-        </w:rPr>
-        <w:t xml:space="preserve">🚨 10. </w:t>
-      </w:r>
-      <w:r>
-        <w:rPr>
-          <w:rFonts w:ascii="Segoe UI Emoji" w:eastAsia="標楷體" w:hAnsi="Segoe UI Emoji" w:cs="Segoe UI Emoji"/>
-        </w:rPr>
-        <w:t>上傳同名圖片導致伺服器檔案覆蓋</w:t>
-      </w:r>
-    </w:p>
-    <w:p>
-      <w:pPr>
-        <w:spacing w:before="120" w:after="120" w:line="336" w:lineRule="auto"/>
-        <w:rPr>
-          <w:rFonts w:ascii="Segoe UI Emoji" w:eastAsia="標楷體" w:hAnsi="Segoe UI Emoji" w:cs="Segoe UI Emoji"/>
-        </w:rPr>
-      </w:pPr>
-      <w:r>
-        <w:rPr>
-          <w:rFonts w:ascii="Segoe UI Emoji" w:eastAsia="標楷體" w:hAnsi="Segoe UI Emoji" w:cs="Segoe UI Emoji"/>
-        </w:rPr>
-        <w:t xml:space="preserve">🔍 </w:t>
-      </w:r>
-      <w:r>
-        <w:rPr>
-          <w:rFonts w:ascii="Segoe UI Emoji" w:eastAsia="標楷體" w:hAnsi="Segoe UI Emoji" w:cs="Segoe UI Emoji"/>
-        </w:rPr>
-        <w:t>當時狀況：</w:t>
-      </w:r>
-      <w:r>
-        <w:rPr>
-          <w:rFonts w:ascii="Segoe UI Emoji" w:eastAsia="標楷體" w:hAnsi="Segoe UI Emoji" w:cs="Segoe UI Emoji"/>
-        </w:rPr>
-        <w:t xml:space="preserve"> </w:t>
-      </w:r>
-      <w:r>
-        <w:rPr>
-          <w:rFonts w:ascii="Segoe UI Emoji" w:eastAsia="標楷體" w:hAnsi="Segoe UI Emoji" w:cs="Segoe UI Emoji"/>
-        </w:rPr>
-        <w:t>不同的使用者在客戶端上傳圖片時，可能都將檔案命名為</w:t>
-      </w:r>
-      <w:r>
-        <w:rPr>
-          <w:rFonts w:ascii="Segoe UI Emoji" w:eastAsia="標楷體" w:hAnsi="Segoe UI Emoji" w:cs="Segoe UI Emoji"/>
-        </w:rPr>
-        <w:t xml:space="preserve"> cover.jpg </w:t>
-      </w:r>
-      <w:r>
-        <w:rPr>
-          <w:rFonts w:ascii="Segoe UI Emoji" w:eastAsia="標楷體" w:hAnsi="Segoe UI Emoji" w:cs="Segoe UI Emoji"/>
-        </w:rPr>
-        <w:t>或</w:t>
-      </w:r>
-      <w:r>
-        <w:rPr>
-          <w:rFonts w:ascii="Segoe UI Emoji" w:eastAsia="標楷體" w:hAnsi="Segoe UI Emoji" w:cs="Segoe UI Emoji"/>
-        </w:rPr>
-        <w:t xml:space="preserve"> test.jpg</w:t>
-      </w:r>
-      <w:r>
-        <w:rPr>
-          <w:rFonts w:ascii="Segoe UI Emoji" w:eastAsia="標楷體" w:hAnsi="Segoe UI Emoji" w:cs="Segoe UI Emoji"/>
-        </w:rPr>
-        <w:t>。若直接將客戶端檔名存入伺服器，後上傳的圖片會直接把前面使用者的圖片覆蓋掉，導致破圖或圖文不符。</w:t>
-      </w:r>
-    </w:p>
-    <w:p>
-      <w:pPr>
-        <w:spacing w:before="120" w:after="120" w:line="336" w:lineRule="auto"/>
-        <w:rPr>
-          <w:rFonts w:ascii="Segoe UI Emoji" w:eastAsia="標楷體" w:hAnsi="Segoe UI Emoji" w:cs="Segoe UI Emoji"/>
-        </w:rPr>
-      </w:pPr>
-      <w:r>
-        <w:rPr>
-          <w:rFonts w:ascii="Segoe UI Emoji" w:eastAsia="標楷體" w:hAnsi="Segoe UI Emoji" w:cs="Segoe UI Emoji"/>
-        </w:rPr>
-        <w:t xml:space="preserve">💡 </w:t>
-      </w:r>
-      <w:r>
-        <w:rPr>
-          <w:rFonts w:ascii="Segoe UI Emoji" w:eastAsia="標楷體" w:hAnsi="Segoe UI Emoji" w:cs="Segoe UI Emoji"/>
-        </w:rPr>
-        <w:t>解決方式：</w:t>
-      </w:r>
-      <w:r>
-        <w:rPr>
-          <w:rFonts w:ascii="Segoe UI Emoji" w:eastAsia="標楷體" w:hAnsi="Segoe UI Emoji" w:cs="Segoe UI Emoji"/>
-        </w:rPr>
-        <w:t xml:space="preserve"> </w:t>
-      </w:r>
-      <w:r>
-        <w:rPr>
-          <w:rFonts w:ascii="Segoe UI Emoji" w:eastAsia="標楷體" w:hAnsi="Segoe UI Emoji" w:cs="Segoe UI Emoji"/>
-        </w:rPr>
-        <w:t>在</w:t>
-      </w:r>
-      <w:proofErr w:type="gramStart"/>
-      <w:r>
-        <w:rPr>
-          <w:rFonts w:ascii="Segoe UI Emoji" w:eastAsia="標楷體" w:hAnsi="Segoe UI Emoji" w:cs="Segoe UI Emoji"/>
-        </w:rPr>
-        <w:t>後</w:t>
-      </w:r>
-      <w:proofErr w:type="gramEnd"/>
-      <w:r>
-        <w:rPr>
-          <w:rFonts w:ascii="Segoe UI Emoji" w:eastAsia="標楷體" w:hAnsi="Segoe UI Emoji" w:cs="Segoe UI Emoji"/>
-        </w:rPr>
-        <w:t>端</w:t>
-      </w:r>
-      <w:r>
-        <w:rPr>
-          <w:rFonts w:ascii="Segoe UI Emoji" w:eastAsia="標楷體" w:hAnsi="Segoe UI Emoji" w:cs="Segoe UI Emoji"/>
-        </w:rPr>
-        <w:t xml:space="preserve"> API (</w:t>
-      </w:r>
-      <w:proofErr w:type="spellStart"/>
-      <w:r>
-        <w:rPr>
-          <w:rFonts w:ascii="Segoe UI Emoji" w:eastAsia="標楷體" w:hAnsi="Segoe UI Emoji" w:cs="Segoe UI Emoji"/>
-        </w:rPr>
-        <w:t>upload_book.php</w:t>
-      </w:r>
-      <w:proofErr w:type="spellEnd"/>
-      <w:r>
-        <w:rPr>
-          <w:rFonts w:ascii="Segoe UI Emoji" w:eastAsia="標楷體" w:hAnsi="Segoe UI Emoji" w:cs="Segoe UI Emoji"/>
-        </w:rPr>
-        <w:t xml:space="preserve">) </w:t>
-      </w:r>
-      <w:r>
-        <w:rPr>
-          <w:rFonts w:ascii="Segoe UI Emoji" w:eastAsia="標楷體" w:hAnsi="Segoe UI Emoji" w:cs="Segoe UI Emoji"/>
-        </w:rPr>
-        <w:t>接收檔案時，</w:t>
-      </w:r>
-      <w:proofErr w:type="gramStart"/>
-      <w:r>
-        <w:rPr>
-          <w:rFonts w:ascii="Segoe UI Emoji" w:eastAsia="標楷體" w:hAnsi="Segoe UI Emoji" w:cs="Segoe UI Emoji"/>
-        </w:rPr>
-        <w:t>徹</w:t>
-      </w:r>
-      <w:proofErr w:type="gramEnd"/>
-      <w:r>
-        <w:rPr>
-          <w:rFonts w:ascii="Segoe UI Emoji" w:eastAsia="標楷體" w:hAnsi="Segoe UI Emoji" w:cs="Segoe UI Emoji"/>
-        </w:rPr>
-        <w:t>底</w:t>
-      </w:r>
-      <w:proofErr w:type="gramStart"/>
-      <w:r>
-        <w:rPr>
-          <w:rFonts w:ascii="Segoe UI Emoji" w:eastAsia="標楷體" w:hAnsi="Segoe UI Emoji" w:cs="Segoe UI Emoji"/>
-        </w:rPr>
-        <w:t>捨</w:t>
-      </w:r>
-      <w:proofErr w:type="gramEnd"/>
-      <w:r>
-        <w:rPr>
-          <w:rFonts w:ascii="Segoe UI Emoji" w:eastAsia="標楷體" w:hAnsi="Segoe UI Emoji" w:cs="Segoe UI Emoji"/>
-        </w:rPr>
-        <w:t>棄原始檔名。改用</w:t>
-      </w:r>
-      <w:r>
-        <w:rPr>
-          <w:rFonts w:ascii="Segoe UI Emoji" w:eastAsia="標楷體" w:hAnsi="Segoe UI Emoji" w:cs="Segoe UI Emoji"/>
-        </w:rPr>
-        <w:t xml:space="preserve"> PHP </w:t>
-      </w:r>
-      <w:r>
-        <w:rPr>
-          <w:rFonts w:ascii="Segoe UI Emoji" w:eastAsia="標楷體" w:hAnsi="Segoe UI Emoji" w:cs="Segoe UI Emoji"/>
-        </w:rPr>
-        <w:t>的</w:t>
-      </w:r>
-      <w:r>
-        <w:rPr>
-          <w:rFonts w:ascii="Segoe UI Emoji" w:eastAsia="標楷體" w:hAnsi="Segoe UI Emoji" w:cs="Segoe UI Emoji"/>
-        </w:rPr>
-        <w:t xml:space="preserve"> </w:t>
-      </w:r>
-      <w:proofErr w:type="spellStart"/>
-      <w:r>
-        <w:rPr>
-          <w:rFonts w:ascii="Segoe UI Emoji" w:eastAsia="標楷體" w:hAnsi="Segoe UI Emoji" w:cs="Segoe UI Emoji"/>
-        </w:rPr>
-        <w:t>uniqid</w:t>
-      </w:r>
-      <w:proofErr w:type="spellEnd"/>
-      <w:r>
-        <w:rPr>
-          <w:rFonts w:ascii="Segoe UI Emoji" w:eastAsia="標楷體" w:hAnsi="Segoe UI Emoji" w:cs="Segoe UI Emoji"/>
-        </w:rPr>
-        <w:t xml:space="preserve">('book_') </w:t>
-      </w:r>
-      <w:r>
-        <w:rPr>
-          <w:rFonts w:ascii="Segoe UI Emoji" w:eastAsia="標楷體" w:hAnsi="Segoe UI Emoji" w:cs="Segoe UI Emoji"/>
-        </w:rPr>
-        <w:t>函</w:t>
-      </w:r>
-      <w:proofErr w:type="gramStart"/>
-      <w:r>
-        <w:rPr>
-          <w:rFonts w:ascii="Segoe UI Emoji" w:eastAsia="標楷體" w:hAnsi="Segoe UI Emoji" w:cs="Segoe UI Emoji"/>
-        </w:rPr>
-        <w:t>數</w:t>
-      </w:r>
-      <w:proofErr w:type="gramEnd"/>
-      <w:r>
-        <w:rPr>
-          <w:rFonts w:ascii="Segoe UI Emoji" w:eastAsia="標楷體" w:hAnsi="Segoe UI Emoji" w:cs="Segoe UI Emoji"/>
-        </w:rPr>
-        <w:t>搭配原始副檔名，</w:t>
-      </w:r>
-      <w:proofErr w:type="gramStart"/>
-      <w:r>
-        <w:rPr>
-          <w:rFonts w:ascii="Segoe UI Emoji" w:eastAsia="標楷體" w:hAnsi="Segoe UI Emoji" w:cs="Segoe UI Emoji"/>
-        </w:rPr>
-        <w:t>為</w:t>
-      </w:r>
-      <w:proofErr w:type="gramEnd"/>
-      <w:r>
-        <w:rPr>
-          <w:rFonts w:ascii="Segoe UI Emoji" w:eastAsia="標楷體" w:hAnsi="Segoe UI Emoji" w:cs="Segoe UI Emoji"/>
-        </w:rPr>
-        <w:t>每張圖片在伺服器端</w:t>
-      </w:r>
-      <w:proofErr w:type="gramStart"/>
-      <w:r>
-        <w:rPr>
-          <w:rFonts w:ascii="Segoe UI Emoji" w:eastAsia="標楷體" w:hAnsi="Segoe UI Emoji" w:cs="Segoe UI Emoji"/>
-        </w:rPr>
-        <w:t>動</w:t>
-      </w:r>
-      <w:proofErr w:type="gramEnd"/>
-      <w:r>
-        <w:rPr>
-          <w:rFonts w:ascii="Segoe UI Emoji" w:eastAsia="標楷體" w:hAnsi="Segoe UI Emoji" w:cs="Segoe UI Emoji"/>
-        </w:rPr>
-        <w:t>態生成唯一且不重複的新檔名（如</w:t>
-      </w:r>
-      <w:r>
-        <w:rPr>
-          <w:rFonts w:ascii="Segoe UI Emoji" w:eastAsia="標楷體" w:hAnsi="Segoe UI Emoji" w:cs="Segoe UI Emoji"/>
-        </w:rPr>
-        <w:t xml:space="preserve"> book_64a1b.jpg</w:t>
-      </w:r>
-      <w:r>
-        <w:rPr>
-          <w:rFonts w:ascii="Segoe UI Emoji" w:eastAsia="標楷體" w:hAnsi="Segoe UI Emoji" w:cs="Segoe UI Emoji"/>
-        </w:rPr>
-        <w:t>），</w:t>
-      </w:r>
-      <w:proofErr w:type="gramStart"/>
-      <w:r>
-        <w:rPr>
-          <w:rFonts w:ascii="Segoe UI Emoji" w:eastAsia="標楷體" w:hAnsi="Segoe UI Emoji" w:cs="Segoe UI Emoji"/>
-        </w:rPr>
-        <w:t>從</w:t>
-      </w:r>
-      <w:proofErr w:type="gramEnd"/>
-      <w:r>
-        <w:rPr>
-          <w:rFonts w:ascii="Segoe UI Emoji" w:eastAsia="標楷體" w:hAnsi="Segoe UI Emoji" w:cs="Segoe UI Emoji"/>
-        </w:rPr>
-        <w:t>根本解決命名衝突。</w:t>
-      </w:r>
-    </w:p>
-    <w:p>
-      <w:pPr>
-        <w:spacing w:before="120" w:after="120" w:line="336" w:lineRule="auto"/>
+          <w:rFonts w:ascii="標楷體" w:eastAsia="DengXian" w:hAnsi="標楷體" w:cs="Segoe UI Emoji"/>
+        </w:rPr>
+        <w:t>&gt;"&gt;&lt;/script&gt;</w:t>
+      </w:r>
+      <w:r>
+        <w:rPr>
+          <w:rFonts w:ascii="標楷體" w:eastAsia="DengXian" w:hAnsi="標楷體" w:cs="Segoe UI Emoji"/>
+        </w:rPr>
+        <w:t>），利用</w:t>
+      </w:r>
+      <w:r>
+        <w:rPr>
+          <w:rFonts w:ascii="標楷體" w:eastAsia="DengXian" w:hAnsi="標楷體" w:cs="Segoe UI Emoji"/>
+        </w:rPr>
+        <w:t xml:space="preserve"> Cache Buster </w:t>
+      </w:r>
+      <w:r>
+        <w:rPr>
+          <w:rFonts w:ascii="標楷體" w:eastAsia="DengXian" w:hAnsi="標楷體" w:cs="Segoe UI Emoji"/>
+        </w:rPr>
+        <w:t>機制強迫瀏覽器每次重整都下載最新的腳本，成功打通真實資料流。</w:t>
+      </w:r>
+    </w:p>
+    <w:p>
+      <w:pPr>
+        <w:spacing w:before="120" w:after="120" w:line="336" w:lineRule="auto"/>
+        <w:rPr>
+          <w:rFonts w:ascii="標楷體" w:eastAsia="DengXian" w:hAnsi="標楷體" w:cs="Segoe UI Emoji"/>
+          <w:lang w:eastAsia="zh-CN"/>
+        </w:rPr>
+      </w:pPr>
+      <w:r>
         <w:rPr>
           <w:rFonts w:ascii="Segoe UI Emoji" w:eastAsia="DengXian" w:hAnsi="Segoe UI Emoji" w:cs="Segoe UI Emoji"/>
           <w:lang w:eastAsia="zh-CN"/>
         </w:rPr>
-      </w:pPr>
-      <w:r>
-        <w:rPr>
-          <w:rFonts w:ascii="Segoe UI Emoji" w:eastAsia="標楷體" w:hAnsi="Segoe UI Emoji" w:cs="Segoe UI Emoji"/>
-        </w:rPr>
-        <w:t xml:space="preserve">📌 </w:t>
-      </w:r>
-      <w:r>
-        <w:rPr>
-          <w:rFonts w:ascii="Segoe UI Emoji" w:eastAsia="標楷體" w:hAnsi="Segoe UI Emoji" w:cs="Segoe UI Emoji"/>
-        </w:rPr>
-        <w:t>對應版本：</w:t>
-      </w:r>
-      <w:r>
-        <w:rPr>
-          <w:rFonts w:ascii="Segoe UI Emoji" w:eastAsia="標楷體" w:hAnsi="Segoe UI Emoji" w:cs="Segoe UI Emoji"/>
-        </w:rPr>
-        <w:t xml:space="preserve"> v0.3.5</w:t>
-      </w:r>
-    </w:p>
-    <w:p>
-      <w:pPr>
-        <w:spacing w:before="120" w:after="120" w:line="336" w:lineRule="auto"/>
-        <w:rPr>
-          <w:rFonts w:ascii="Segoe UI Emoji" w:eastAsia="DengXian" w:hAnsi="Segoe UI Emoji" w:cs="Segoe UI Emoji"/>
+        <w:t>📌</w:t>
+      </w:r>
+      <w:r>
+        <w:rPr>
+          <w:rFonts w:ascii="標楷體" w:eastAsia="DengXian" w:hAnsi="標楷體" w:cs="Segoe UI Emoji"/>
           <w:lang w:eastAsia="zh-CN"/>
         </w:rPr>
-      </w:pPr>
-    </w:p>
-    <w:p>
-      <w:pPr>
-        <w:spacing w:before="120" w:after="120" w:line="336" w:lineRule="auto"/>
-        <w:rPr>
-          <w:rFonts w:ascii="標楷體" w:eastAsia="標楷體" w:hAnsi="標楷體" w:cs="Segoe UI Emoji" w:hint="eastAsia"/>
+        <w:t xml:space="preserve"> </w:t>
+      </w:r>
+      <w:proofErr w:type="gramStart"/>
+      <w:r>
+        <w:rPr>
+          <w:rFonts w:ascii="標楷體" w:eastAsia="DengXian" w:hAnsi="標楷體" w:cs="Segoe UI Emoji"/>
+          <w:lang w:eastAsia="zh-CN"/>
+        </w:rPr>
+        <w:t>對應</w:t>
+      </w:r>
+      <w:proofErr w:type="gramEnd"/>
+      <w:r>
+        <w:rPr>
+          <w:rFonts w:ascii="標楷體" w:eastAsia="DengXian" w:hAnsi="標楷體" w:cs="Segoe UI Emoji"/>
+          <w:lang w:eastAsia="zh-CN"/>
+        </w:rPr>
+        <w:t>版本：</w:t>
+      </w:r>
+      <w:r>
+        <w:rPr>
+          <w:rFonts w:ascii="標楷體" w:eastAsia="DengXian" w:hAnsi="標楷體" w:cs="Segoe UI Emoji"/>
+          <w:lang w:eastAsia="zh-CN"/>
+        </w:rPr>
+        <w:t xml:space="preserve"> v0.4.1</w:t>
+      </w:r>
+    </w:p>
+    <w:p>
+      <w:pPr>
+        <w:spacing w:before="120" w:after="120" w:line="336" w:lineRule="auto"/>
+        <w:rPr>
+          <w:rFonts w:ascii="標楷體" w:eastAsia="DengXian" w:hAnsi="標楷體" w:cs="Segoe UI Emoji"/>
+          <w:lang w:eastAsia="zh-CN"/>
+        </w:rPr>
+      </w:pPr>
+    </w:p>
+    <w:p>
+      <w:pPr>
+        <w:spacing w:before="120" w:after="120" w:line="336" w:lineRule="auto"/>
+        <w:rPr>
+          <w:rFonts w:ascii="標楷體" w:eastAsia="DengXian" w:hAnsi="標楷體" w:cs="Segoe UI Emoji" w:hint="eastAsia"/>
           <w:lang w:eastAsia="zh-CN"/>
         </w:rPr>
       </w:pPr>

</xml_diff>